<commit_message>
chore: Remove output files for DOCX and PDF formats, and update .gitignore to exclude credentials.json.
</commit_message>
<xml_diff>
--- a/magmo3at/المجموعة الرابعة_ تعاوني بضغط زمني.docx
+++ b/magmo3at/المجموعة الرابعة_ تعاوني بضغط زمني.docx
@@ -2009,584 +2009,59 @@
         </w:rPr>
       </w:pPr>
       <w:r>
-        <w:rPr>
-          <w:rFonts w:ascii="Jomhuria" w:cs="Jomhuria" w:eastAsia="Jomhuria" w:hAnsi="Jomhuria"/>
-          <w:sz w:val="24"/>
-          <w:szCs w:val="24"/>
-          <w:rtl w:val="1"/>
-        </w:rPr>
-        <w:t xml:space="preserve">اليوم</w:t>
-      </w:r>
-      <w:r>
-        <w:rPr>
-          <w:rFonts w:ascii="Roboto Mono" w:cs="Roboto Mono" w:eastAsia="Roboto Mono" w:hAnsi="Roboto Mono"/>
-          <w:sz w:val="24"/>
-          <w:szCs w:val="24"/>
-          <w:rtl w:val="1"/>
-        </w:rPr>
-        <w:t xml:space="preserve"> 1-4:   📖 </w:t>
-      </w:r>
-      <w:r>
-        <w:rPr>
-          <w:rFonts w:ascii="Roboto Mono" w:cs="Roboto Mono" w:eastAsia="Roboto Mono" w:hAnsi="Roboto Mono"/>
-          <w:sz w:val="24"/>
-          <w:szCs w:val="24"/>
-          <w:rtl w:val="0"/>
-        </w:rPr>
-        <w:t xml:space="preserve">M</w:t>
-      </w:r>
-      <w:r>
-        <w:rPr>
-          <w:rFonts w:ascii="Nova Mono" w:cs="Nova Mono" w:eastAsia="Nova Mono" w:hAnsi="Nova Mono"/>
-          <w:sz w:val="24"/>
-          <w:szCs w:val="24"/>
-          <w:rtl w:val="1"/>
-        </w:rPr>
-        <w:t xml:space="preserve">1 → </w:t>
-      </w:r>
-      <w:r>
-        <w:rPr>
-          <w:rFonts w:ascii="Jomhuria" w:cs="Jomhuria" w:eastAsia="Jomhuria" w:hAnsi="Jomhuria"/>
-          <w:sz w:val="24"/>
-          <w:szCs w:val="24"/>
-          <w:rtl w:val="1"/>
-        </w:rPr>
-        <w:t xml:space="preserve">الموعد</w:t>
-      </w:r>
-      <w:r>
-        <w:rPr>
-          <w:rFonts w:ascii="Roboto Mono" w:cs="Roboto Mono" w:eastAsia="Roboto Mono" w:hAnsi="Roboto Mono"/>
-          <w:sz w:val="24"/>
-          <w:szCs w:val="24"/>
-          <w:rtl w:val="1"/>
-        </w:rPr>
-        <w:t xml:space="preserve"> </w:t>
-      </w:r>
-      <w:r>
-        <w:rPr>
-          <w:rFonts w:ascii="Jomhuria" w:cs="Jomhuria" w:eastAsia="Jomhuria" w:hAnsi="Jomhuria"/>
-          <w:sz w:val="24"/>
-          <w:szCs w:val="24"/>
-          <w:rtl w:val="1"/>
-        </w:rPr>
-        <w:t xml:space="preserve">النهائي</w:t>
-      </w:r>
-      <w:r>
-        <w:rPr>
-          <w:rFonts w:ascii="Roboto Mono" w:cs="Roboto Mono" w:eastAsia="Roboto Mono" w:hAnsi="Roboto Mono"/>
-          <w:sz w:val="24"/>
-          <w:szCs w:val="24"/>
-          <w:rtl w:val="1"/>
-        </w:rPr>
-        <w:t xml:space="preserve">: </w:t>
-      </w:r>
-      <w:r>
-        <w:rPr>
-          <w:rFonts w:ascii="Jomhuria" w:cs="Jomhuria" w:eastAsia="Jomhuria" w:hAnsi="Jomhuria"/>
-          <w:sz w:val="24"/>
-          <w:szCs w:val="24"/>
-          <w:rtl w:val="1"/>
-        </w:rPr>
-        <w:t xml:space="preserve">يوم</w:t>
-      </w:r>
-      <w:r>
-        <w:rPr>
-          <w:rFonts w:ascii="Jomhuria" w:cs="Jomhuria" w:eastAsia="Jomhuria" w:hAnsi="Jomhuria"/>
-          <w:sz w:val="24"/>
-          <w:szCs w:val="24"/>
-          <w:rtl w:val="1"/>
-        </w:rPr>
-        <w:t xml:space="preserve"> 4، 11:59 </w:t>
-      </w:r>
-      <w:r>
-        <w:rPr>
-          <w:rFonts w:ascii="Jomhuria" w:cs="Jomhuria" w:eastAsia="Jomhuria" w:hAnsi="Jomhuria"/>
-          <w:sz w:val="24"/>
-          <w:szCs w:val="24"/>
-          <w:rtl w:val="1"/>
-        </w:rPr>
-        <w:t xml:space="preserve">م</w:t>
-      </w:r>
-      <w:r>
-        <w:rPr>
-          <w:rFonts w:ascii="Arial Unicode MS" w:cs="Arial Unicode MS" w:eastAsia="Arial Unicode MS" w:hAnsi="Arial Unicode MS"/>
-          <w:sz w:val="24"/>
-          <w:szCs w:val="24"/>
-          <w:rtl w:val="1"/>
-        </w:rPr>
-        <w:t xml:space="preserve"> ⏰</w:t>
-      </w:r>
-    </w:p>
-    <w:p>
-      <w:pPr>
-        <w:bidi w:val="1"/>
-        <w:rPr>
-          <w:rFonts w:ascii="Roboto Mono" w:cs="Roboto Mono" w:eastAsia="Roboto Mono" w:hAnsi="Roboto Mono"/>
-          <w:sz w:val="24"/>
-          <w:szCs w:val="24"/>
-        </w:rPr>
-      </w:pPr>
-      <w:r>
-        <w:rPr>
-          <w:rFonts w:ascii="Jomhuria" w:cs="Jomhuria" w:eastAsia="Jomhuria" w:hAnsi="Jomhuria"/>
-          <w:sz w:val="24"/>
-          <w:szCs w:val="24"/>
-          <w:rtl w:val="1"/>
-        </w:rPr>
-        <w:t xml:space="preserve">اليوم</w:t>
-      </w:r>
-      <w:r>
-        <w:rPr>
-          <w:rFonts w:ascii="Roboto Mono" w:cs="Roboto Mono" w:eastAsia="Roboto Mono" w:hAnsi="Roboto Mono"/>
-          <w:sz w:val="24"/>
-          <w:szCs w:val="24"/>
-          <w:rtl w:val="1"/>
-        </w:rPr>
-        <w:t xml:space="preserve"> 5-9:   🔍 </w:t>
-      </w:r>
-      <w:r>
-        <w:rPr>
-          <w:rFonts w:ascii="Roboto Mono" w:cs="Roboto Mono" w:eastAsia="Roboto Mono" w:hAnsi="Roboto Mono"/>
-          <w:sz w:val="24"/>
-          <w:szCs w:val="24"/>
-          <w:rtl w:val="0"/>
-        </w:rPr>
-        <w:t xml:space="preserve">M</w:t>
-      </w:r>
-      <w:r>
-        <w:rPr>
-          <w:rFonts w:ascii="Nova Mono" w:cs="Nova Mono" w:eastAsia="Nova Mono" w:hAnsi="Nova Mono"/>
-          <w:sz w:val="24"/>
-          <w:szCs w:val="24"/>
-          <w:rtl w:val="1"/>
-        </w:rPr>
-        <w:t xml:space="preserve">2 → </w:t>
-      </w:r>
-      <w:r>
-        <w:rPr>
-          <w:rFonts w:ascii="Jomhuria" w:cs="Jomhuria" w:eastAsia="Jomhuria" w:hAnsi="Jomhuria"/>
-          <w:sz w:val="24"/>
-          <w:szCs w:val="24"/>
-          <w:rtl w:val="1"/>
-        </w:rPr>
-        <w:t xml:space="preserve">الموعد</w:t>
-      </w:r>
-      <w:r>
-        <w:rPr>
-          <w:rFonts w:ascii="Roboto Mono" w:cs="Roboto Mono" w:eastAsia="Roboto Mono" w:hAnsi="Roboto Mono"/>
-          <w:sz w:val="24"/>
-          <w:szCs w:val="24"/>
-          <w:rtl w:val="1"/>
-        </w:rPr>
-        <w:t xml:space="preserve"> </w:t>
-      </w:r>
-      <w:r>
-        <w:rPr>
-          <w:rFonts w:ascii="Jomhuria" w:cs="Jomhuria" w:eastAsia="Jomhuria" w:hAnsi="Jomhuria"/>
-          <w:sz w:val="24"/>
-          <w:szCs w:val="24"/>
-          <w:rtl w:val="1"/>
-        </w:rPr>
-        <w:t xml:space="preserve">النهائي</w:t>
-      </w:r>
-      <w:r>
-        <w:rPr>
-          <w:rFonts w:ascii="Roboto Mono" w:cs="Roboto Mono" w:eastAsia="Roboto Mono" w:hAnsi="Roboto Mono"/>
-          <w:sz w:val="24"/>
-          <w:szCs w:val="24"/>
-          <w:rtl w:val="1"/>
-        </w:rPr>
-        <w:t xml:space="preserve">: </w:t>
-      </w:r>
-      <w:r>
-        <w:rPr>
-          <w:rFonts w:ascii="Jomhuria" w:cs="Jomhuria" w:eastAsia="Jomhuria" w:hAnsi="Jomhuria"/>
-          <w:sz w:val="24"/>
-          <w:szCs w:val="24"/>
-          <w:rtl w:val="1"/>
-        </w:rPr>
-        <w:t xml:space="preserve">يوم</w:t>
-      </w:r>
-      <w:r>
-        <w:rPr>
-          <w:rFonts w:ascii="Jomhuria" w:cs="Jomhuria" w:eastAsia="Jomhuria" w:hAnsi="Jomhuria"/>
-          <w:sz w:val="24"/>
-          <w:szCs w:val="24"/>
-          <w:rtl w:val="1"/>
-        </w:rPr>
-        <w:t xml:space="preserve"> 9، 11:59 </w:t>
-      </w:r>
-      <w:r>
-        <w:rPr>
-          <w:rFonts w:ascii="Jomhuria" w:cs="Jomhuria" w:eastAsia="Jomhuria" w:hAnsi="Jomhuria"/>
-          <w:sz w:val="24"/>
-          <w:szCs w:val="24"/>
-          <w:rtl w:val="1"/>
-        </w:rPr>
-        <w:t xml:space="preserve">م</w:t>
-      </w:r>
-      <w:r>
-        <w:rPr>
-          <w:rFonts w:ascii="Arial Unicode MS" w:cs="Arial Unicode MS" w:eastAsia="Arial Unicode MS" w:hAnsi="Arial Unicode MS"/>
-          <w:sz w:val="24"/>
-          <w:szCs w:val="24"/>
-          <w:rtl w:val="1"/>
-        </w:rPr>
-        <w:t xml:space="preserve"> ⏰</w:t>
-      </w:r>
-    </w:p>
-    <w:p>
-      <w:pPr>
-        <w:bidi w:val="1"/>
-        <w:rPr>
-          <w:rFonts w:ascii="Roboto Mono" w:cs="Roboto Mono" w:eastAsia="Roboto Mono" w:hAnsi="Roboto Mono"/>
-          <w:sz w:val="24"/>
-          <w:szCs w:val="24"/>
-        </w:rPr>
-      </w:pPr>
-      <w:r>
-        <w:rPr>
-          <w:rFonts w:ascii="Jomhuria" w:cs="Jomhuria" w:eastAsia="Jomhuria" w:hAnsi="Jomhuria"/>
-          <w:sz w:val="24"/>
-          <w:szCs w:val="24"/>
-          <w:rtl w:val="1"/>
-        </w:rPr>
-        <w:t xml:space="preserve">اليوم</w:t>
-      </w:r>
-      <w:r>
-        <w:rPr>
-          <w:rFonts w:ascii="Roboto Mono" w:cs="Roboto Mono" w:eastAsia="Roboto Mono" w:hAnsi="Roboto Mono"/>
-          <w:sz w:val="24"/>
-          <w:szCs w:val="24"/>
-          <w:rtl w:val="1"/>
-        </w:rPr>
-        <w:t xml:space="preserve"> 10-15: 🧠 </w:t>
-      </w:r>
-      <w:r>
-        <w:rPr>
-          <w:rFonts w:ascii="Roboto Mono" w:cs="Roboto Mono" w:eastAsia="Roboto Mono" w:hAnsi="Roboto Mono"/>
-          <w:sz w:val="24"/>
-          <w:szCs w:val="24"/>
-          <w:rtl w:val="0"/>
-        </w:rPr>
-        <w:t xml:space="preserve">M</w:t>
-      </w:r>
-      <w:r>
-        <w:rPr>
-          <w:rFonts w:ascii="Nova Mono" w:cs="Nova Mono" w:eastAsia="Nova Mono" w:hAnsi="Nova Mono"/>
-          <w:sz w:val="24"/>
-          <w:szCs w:val="24"/>
-          <w:rtl w:val="1"/>
-        </w:rPr>
-        <w:t xml:space="preserve">3 → </w:t>
-      </w:r>
-      <w:r>
-        <w:rPr>
-          <w:rFonts w:ascii="Jomhuria" w:cs="Jomhuria" w:eastAsia="Jomhuria" w:hAnsi="Jomhuria"/>
-          <w:sz w:val="24"/>
-          <w:szCs w:val="24"/>
-          <w:rtl w:val="1"/>
-        </w:rPr>
-        <w:t xml:space="preserve">الموعد</w:t>
-      </w:r>
-      <w:r>
-        <w:rPr>
-          <w:rFonts w:ascii="Roboto Mono" w:cs="Roboto Mono" w:eastAsia="Roboto Mono" w:hAnsi="Roboto Mono"/>
-          <w:sz w:val="24"/>
-          <w:szCs w:val="24"/>
-          <w:rtl w:val="1"/>
-        </w:rPr>
-        <w:t xml:space="preserve"> </w:t>
-      </w:r>
-      <w:r>
-        <w:rPr>
-          <w:rFonts w:ascii="Jomhuria" w:cs="Jomhuria" w:eastAsia="Jomhuria" w:hAnsi="Jomhuria"/>
-          <w:sz w:val="24"/>
-          <w:szCs w:val="24"/>
-          <w:rtl w:val="1"/>
-        </w:rPr>
-        <w:t xml:space="preserve">النهائي</w:t>
-      </w:r>
-      <w:r>
-        <w:rPr>
-          <w:rFonts w:ascii="Roboto Mono" w:cs="Roboto Mono" w:eastAsia="Roboto Mono" w:hAnsi="Roboto Mono"/>
-          <w:sz w:val="24"/>
-          <w:szCs w:val="24"/>
-          <w:rtl w:val="1"/>
-        </w:rPr>
-        <w:t xml:space="preserve">: </w:t>
-      </w:r>
-      <w:r>
-        <w:rPr>
-          <w:rFonts w:ascii="Jomhuria" w:cs="Jomhuria" w:eastAsia="Jomhuria" w:hAnsi="Jomhuria"/>
-          <w:sz w:val="24"/>
-          <w:szCs w:val="24"/>
-          <w:rtl w:val="1"/>
-        </w:rPr>
-        <w:t xml:space="preserve">يوم</w:t>
-      </w:r>
-      <w:r>
-        <w:rPr>
-          <w:rFonts w:ascii="Jomhuria" w:cs="Jomhuria" w:eastAsia="Jomhuria" w:hAnsi="Jomhuria"/>
-          <w:sz w:val="24"/>
-          <w:szCs w:val="24"/>
-          <w:rtl w:val="1"/>
-        </w:rPr>
-        <w:t xml:space="preserve"> 15، 11:59 </w:t>
-      </w:r>
-      <w:r>
-        <w:rPr>
-          <w:rFonts w:ascii="Jomhuria" w:cs="Jomhuria" w:eastAsia="Jomhuria" w:hAnsi="Jomhuria"/>
-          <w:sz w:val="24"/>
-          <w:szCs w:val="24"/>
-          <w:rtl w:val="1"/>
-        </w:rPr>
-        <w:t xml:space="preserve">م</w:t>
-      </w:r>
-      <w:r>
-        <w:rPr>
-          <w:rFonts w:ascii="Arial Unicode MS" w:cs="Arial Unicode MS" w:eastAsia="Arial Unicode MS" w:hAnsi="Arial Unicode MS"/>
-          <w:sz w:val="24"/>
-          <w:szCs w:val="24"/>
-          <w:rtl w:val="1"/>
-        </w:rPr>
-        <w:t xml:space="preserve"> ⏰</w:t>
-      </w:r>
-    </w:p>
-    <w:p>
-      <w:pPr>
-        <w:bidi w:val="1"/>
-        <w:rPr>
-          <w:rFonts w:ascii="Roboto Mono" w:cs="Roboto Mono" w:eastAsia="Roboto Mono" w:hAnsi="Roboto Mono"/>
-          <w:sz w:val="24"/>
-          <w:szCs w:val="24"/>
-        </w:rPr>
-      </w:pPr>
-      <w:r>
-        <w:rPr>
-          <w:rFonts w:ascii="Jomhuria" w:cs="Jomhuria" w:eastAsia="Jomhuria" w:hAnsi="Jomhuria"/>
-          <w:sz w:val="24"/>
-          <w:szCs w:val="24"/>
-          <w:rtl w:val="1"/>
-        </w:rPr>
-        <w:t xml:space="preserve">اليوم</w:t>
-      </w:r>
-      <w:r>
-        <w:rPr>
-          <w:rFonts w:ascii="Roboto Mono" w:cs="Roboto Mono" w:eastAsia="Roboto Mono" w:hAnsi="Roboto Mono"/>
-          <w:sz w:val="24"/>
-          <w:szCs w:val="24"/>
-          <w:rtl w:val="1"/>
-        </w:rPr>
-        <w:t xml:space="preserve"> 16-18: ✏️ </w:t>
-      </w:r>
-      <w:r>
-        <w:rPr>
-          <w:rFonts w:ascii="Roboto Mono" w:cs="Roboto Mono" w:eastAsia="Roboto Mono" w:hAnsi="Roboto Mono"/>
-          <w:sz w:val="24"/>
-          <w:szCs w:val="24"/>
-          <w:rtl w:val="0"/>
-        </w:rPr>
-        <w:t xml:space="preserve">M</w:t>
-      </w:r>
-      <w:r>
-        <w:rPr>
-          <w:rFonts w:ascii="Nova Mono" w:cs="Nova Mono" w:eastAsia="Nova Mono" w:hAnsi="Nova Mono"/>
-          <w:sz w:val="24"/>
-          <w:szCs w:val="24"/>
-          <w:rtl w:val="1"/>
-        </w:rPr>
-        <w:t xml:space="preserve">4 → </w:t>
-      </w:r>
-      <w:r>
-        <w:rPr>
-          <w:rFonts w:ascii="Jomhuria" w:cs="Jomhuria" w:eastAsia="Jomhuria" w:hAnsi="Jomhuria"/>
-          <w:sz w:val="24"/>
-          <w:szCs w:val="24"/>
-          <w:rtl w:val="1"/>
-        </w:rPr>
-        <w:t xml:space="preserve">الموعد</w:t>
-      </w:r>
-      <w:r>
-        <w:rPr>
-          <w:rFonts w:ascii="Roboto Mono" w:cs="Roboto Mono" w:eastAsia="Roboto Mono" w:hAnsi="Roboto Mono"/>
-          <w:sz w:val="24"/>
-          <w:szCs w:val="24"/>
-          <w:rtl w:val="1"/>
-        </w:rPr>
-        <w:t xml:space="preserve"> </w:t>
-      </w:r>
-      <w:r>
-        <w:rPr>
-          <w:rFonts w:ascii="Jomhuria" w:cs="Jomhuria" w:eastAsia="Jomhuria" w:hAnsi="Jomhuria"/>
-          <w:sz w:val="24"/>
-          <w:szCs w:val="24"/>
-          <w:rtl w:val="1"/>
-        </w:rPr>
-        <w:t xml:space="preserve">النهائي</w:t>
-      </w:r>
-      <w:r>
-        <w:rPr>
-          <w:rFonts w:ascii="Roboto Mono" w:cs="Roboto Mono" w:eastAsia="Roboto Mono" w:hAnsi="Roboto Mono"/>
-          <w:sz w:val="24"/>
-          <w:szCs w:val="24"/>
-          <w:rtl w:val="1"/>
-        </w:rPr>
-        <w:t xml:space="preserve">: </w:t>
-      </w:r>
-      <w:r>
-        <w:rPr>
-          <w:rFonts w:ascii="Jomhuria" w:cs="Jomhuria" w:eastAsia="Jomhuria" w:hAnsi="Jomhuria"/>
-          <w:sz w:val="24"/>
-          <w:szCs w:val="24"/>
-          <w:rtl w:val="1"/>
-        </w:rPr>
-        <w:t xml:space="preserve">يوم</w:t>
-      </w:r>
-      <w:r>
-        <w:rPr>
-          <w:rFonts w:ascii="Jomhuria" w:cs="Jomhuria" w:eastAsia="Jomhuria" w:hAnsi="Jomhuria"/>
-          <w:sz w:val="24"/>
-          <w:szCs w:val="24"/>
-          <w:rtl w:val="1"/>
-        </w:rPr>
-        <w:t xml:space="preserve"> 18، 11:59 </w:t>
-      </w:r>
-      <w:r>
-        <w:rPr>
-          <w:rFonts w:ascii="Jomhuria" w:cs="Jomhuria" w:eastAsia="Jomhuria" w:hAnsi="Jomhuria"/>
-          <w:sz w:val="24"/>
-          <w:szCs w:val="24"/>
-          <w:rtl w:val="1"/>
-        </w:rPr>
-        <w:t xml:space="preserve">م</w:t>
-      </w:r>
-      <w:r>
-        <w:rPr>
-          <w:rFonts w:ascii="Arial Unicode MS" w:cs="Arial Unicode MS" w:eastAsia="Arial Unicode MS" w:hAnsi="Arial Unicode MS"/>
-          <w:sz w:val="24"/>
-          <w:szCs w:val="24"/>
-          <w:rtl w:val="1"/>
-        </w:rPr>
-        <w:t xml:space="preserve"> ⏰</w:t>
-      </w:r>
-    </w:p>
-    <w:p>
-      <w:pPr>
-        <w:bidi w:val="1"/>
-        <w:rPr>
-          <w:rFonts w:ascii="Roboto Mono" w:cs="Roboto Mono" w:eastAsia="Roboto Mono" w:hAnsi="Roboto Mono"/>
-          <w:sz w:val="24"/>
-          <w:szCs w:val="24"/>
-        </w:rPr>
-      </w:pPr>
-      <w:r>
-        <w:rPr>
-          <w:rFonts w:ascii="Jomhuria" w:cs="Jomhuria" w:eastAsia="Jomhuria" w:hAnsi="Jomhuria"/>
-          <w:sz w:val="24"/>
-          <w:szCs w:val="24"/>
-          <w:rtl w:val="1"/>
-        </w:rPr>
-        <w:t xml:space="preserve">اليوم</w:t>
-      </w:r>
-      <w:r>
-        <w:rPr>
-          <w:rFonts w:ascii="Roboto Mono" w:cs="Roboto Mono" w:eastAsia="Roboto Mono" w:hAnsi="Roboto Mono"/>
-          <w:sz w:val="24"/>
-          <w:szCs w:val="24"/>
-          <w:rtl w:val="1"/>
-        </w:rPr>
-        <w:t xml:space="preserve"> 19-21: 🎓 </w:t>
-      </w:r>
-      <w:r>
-        <w:rPr>
-          <w:rFonts w:ascii="Roboto Mono" w:cs="Roboto Mono" w:eastAsia="Roboto Mono" w:hAnsi="Roboto Mono"/>
-          <w:sz w:val="24"/>
-          <w:szCs w:val="24"/>
-          <w:rtl w:val="0"/>
-        </w:rPr>
-        <w:t xml:space="preserve">M</w:t>
-      </w:r>
-      <w:r>
-        <w:rPr>
-          <w:rFonts w:ascii="Nova Mono" w:cs="Nova Mono" w:eastAsia="Nova Mono" w:hAnsi="Nova Mono"/>
-          <w:sz w:val="24"/>
-          <w:szCs w:val="24"/>
-          <w:rtl w:val="1"/>
-        </w:rPr>
-        <w:t xml:space="preserve">5 → </w:t>
-      </w:r>
-      <w:r>
-        <w:rPr>
-          <w:rFonts w:ascii="Jomhuria" w:cs="Jomhuria" w:eastAsia="Jomhuria" w:hAnsi="Jomhuria"/>
-          <w:sz w:val="24"/>
-          <w:szCs w:val="24"/>
-          <w:rtl w:val="1"/>
-        </w:rPr>
-        <w:t xml:space="preserve">الموعد</w:t>
-      </w:r>
-      <w:r>
-        <w:rPr>
-          <w:rFonts w:ascii="Roboto Mono" w:cs="Roboto Mono" w:eastAsia="Roboto Mono" w:hAnsi="Roboto Mono"/>
-          <w:sz w:val="24"/>
-          <w:szCs w:val="24"/>
-          <w:rtl w:val="1"/>
-        </w:rPr>
-        <w:t xml:space="preserve"> </w:t>
-      </w:r>
-      <w:r>
-        <w:rPr>
-          <w:rFonts w:ascii="Jomhuria" w:cs="Jomhuria" w:eastAsia="Jomhuria" w:hAnsi="Jomhuria"/>
-          <w:sz w:val="24"/>
-          <w:szCs w:val="24"/>
-          <w:rtl w:val="1"/>
-        </w:rPr>
-        <w:t xml:space="preserve">النهائي</w:t>
-      </w:r>
-      <w:r>
-        <w:rPr>
-          <w:rFonts w:ascii="Roboto Mono" w:cs="Roboto Mono" w:eastAsia="Roboto Mono" w:hAnsi="Roboto Mono"/>
-          <w:sz w:val="24"/>
-          <w:szCs w:val="24"/>
-          <w:rtl w:val="1"/>
-        </w:rPr>
-        <w:t xml:space="preserve">: </w:t>
-      </w:r>
-      <w:r>
-        <w:rPr>
-          <w:rFonts w:ascii="Jomhuria" w:cs="Jomhuria" w:eastAsia="Jomhuria" w:hAnsi="Jomhuria"/>
-          <w:sz w:val="24"/>
-          <w:szCs w:val="24"/>
-          <w:rtl w:val="1"/>
-        </w:rPr>
-        <w:t xml:space="preserve">يوم</w:t>
-      </w:r>
-      <w:r>
-        <w:rPr>
-          <w:rFonts w:ascii="Jomhuria" w:cs="Jomhuria" w:eastAsia="Jomhuria" w:hAnsi="Jomhuria"/>
-          <w:sz w:val="24"/>
-          <w:szCs w:val="24"/>
-          <w:rtl w:val="1"/>
-        </w:rPr>
-        <w:t xml:space="preserve"> 21، 11:59 </w:t>
-      </w:r>
-      <w:r>
-        <w:rPr>
-          <w:rFonts w:ascii="Jomhuria" w:cs="Jomhuria" w:eastAsia="Jomhuria" w:hAnsi="Jomhuria"/>
-          <w:sz w:val="24"/>
-          <w:szCs w:val="24"/>
-          <w:rtl w:val="1"/>
-        </w:rPr>
-        <w:t xml:space="preserve">م</w:t>
-      </w:r>
-      <w:r>
-        <w:rPr>
-          <w:rFonts w:ascii="Arial Unicode MS" w:cs="Arial Unicode MS" w:eastAsia="Arial Unicode MS" w:hAnsi="Arial Unicode MS"/>
-          <w:sz w:val="24"/>
-          <w:szCs w:val="24"/>
-          <w:rtl w:val="1"/>
-        </w:rPr>
-        <w:t xml:space="preserve"> ⏰</w:t>
+        <w:t>اليوم 1-3:   📖 M1 → الموعد النهائي: يوم 3، 11:59 م ⏰</w:t>
+      </w:r>
+    </w:p>
+    <w:p>
+      <w:pPr>
+        <w:bidi w:val="1"/>
+        <w:rPr>
+          <w:rFonts w:ascii="Roboto Mono" w:cs="Roboto Mono" w:eastAsia="Roboto Mono" w:hAnsi="Roboto Mono"/>
+          <w:sz w:val="24"/>
+          <w:szCs w:val="24"/>
+        </w:rPr>
+      </w:pPr>
+      <w:r>
+        <w:t>اليوم 3-8:   🔍 M2 → الموعد النهائي: يوم 8، 11:59 م ⏰</w:t>
+      </w:r>
+    </w:p>
+    <w:p>
+      <w:pPr>
+        <w:bidi w:val="1"/>
+        <w:rPr>
+          <w:rFonts w:ascii="Roboto Mono" w:cs="Roboto Mono" w:eastAsia="Roboto Mono" w:hAnsi="Roboto Mono"/>
+          <w:sz w:val="24"/>
+          <w:szCs w:val="24"/>
+        </w:rPr>
+      </w:pPr>
+      <w:r>
+        <w:t>اليوم 8-14: 🧠 M3 → الموعد النهائي: يوم 14، 11:59 م ⏰</w:t>
+      </w:r>
+    </w:p>
+    <w:p>
+      <w:pPr>
+        <w:bidi w:val="1"/>
+        <w:rPr>
+          <w:rFonts w:ascii="Roboto Mono" w:cs="Roboto Mono" w:eastAsia="Roboto Mono" w:hAnsi="Roboto Mono"/>
+          <w:sz w:val="24"/>
+          <w:szCs w:val="24"/>
+        </w:rPr>
+      </w:pPr>
+      <w:r>
+        <w:t>اليوم 14-17: ✏️ M4 → الموعد النهائي: يوم 17، 11:59 م ⏰</w:t>
+      </w:r>
+    </w:p>
+    <w:p>
+      <w:pPr>
+        <w:bidi w:val="1"/>
+        <w:rPr>
+          <w:rFonts w:ascii="Roboto Mono" w:cs="Roboto Mono" w:eastAsia="Roboto Mono" w:hAnsi="Roboto Mono"/>
+          <w:sz w:val="24"/>
+          <w:szCs w:val="24"/>
+        </w:rPr>
+      </w:pPr>
+      <w:r>
+        <w:t>اليوم 17-21: 🎓 M5 → الموعد النهائي: يوم 21، 11:59 م ⏰</w:t>
       </w:r>
     </w:p>
     <w:p>
@@ -3463,486 +2938,46 @@
         </w:rPr>
       </w:pPr>
       <w:r>
-        <w:rPr>
-          <w:rtl w:val="0"/>
-        </w:rPr>
-      </w:r>
-      <w:r>
-        <w:rPr>
-          <w:rFonts w:ascii="Arial Unicode MS" w:cs="Arial Unicode MS" w:eastAsia="Arial Unicode MS" w:hAnsi="Arial Unicode MS"/>
-          <w:sz w:val="24"/>
-          <w:szCs w:val="24"/>
-          <w:rtl w:val="0"/>
-        </w:rPr>
-        <w:t xml:space="preserve">├─ </w:t>
-      </w:r>
-      <w:r>
-        <w:rPr>
-          <w:rFonts w:ascii="Roboto Mono" w:cs="Roboto Mono" w:eastAsia="Roboto Mono" w:hAnsi="Roboto Mono"/>
-          <w:sz w:val="24"/>
-          <w:szCs w:val="24"/>
-          <w:rtl w:val="0"/>
-        </w:rPr>
-        <w:t xml:space="preserve">M</w:t>
-      </w:r>
-      <w:r>
-        <w:rPr>
-          <w:rFonts w:ascii="Roboto Mono" w:cs="Roboto Mono" w:eastAsia="Roboto Mono" w:hAnsi="Roboto Mono"/>
-          <w:sz w:val="24"/>
-          <w:szCs w:val="24"/>
-          <w:rtl w:val="1"/>
-        </w:rPr>
-        <w:t xml:space="preserve">1: </w:t>
-      </w:r>
-      <w:r>
-        <w:rPr>
-          <w:rFonts w:ascii="Jomhuria" w:cs="Jomhuria" w:eastAsia="Jomhuria" w:hAnsi="Jomhuria"/>
-          <w:sz w:val="24"/>
-          <w:szCs w:val="24"/>
-          <w:rtl w:val="1"/>
-        </w:rPr>
-        <w:t xml:space="preserve">ملخص</w:t>
-      </w:r>
-      <w:r>
-        <w:rPr>
-          <w:rFonts w:ascii="Roboto Mono" w:cs="Roboto Mono" w:eastAsia="Roboto Mono" w:hAnsi="Roboto Mono"/>
-          <w:sz w:val="24"/>
-          <w:szCs w:val="24"/>
-          <w:rtl w:val="1"/>
-        </w:rPr>
-        <w:t xml:space="preserve"> </w:t>
-      </w:r>
-      <w:r>
-        <w:rPr>
-          <w:rFonts w:ascii="Jomhuria" w:cs="Jomhuria" w:eastAsia="Jomhuria" w:hAnsi="Jomhuria"/>
-          <w:sz w:val="24"/>
-          <w:szCs w:val="24"/>
-          <w:rtl w:val="1"/>
-        </w:rPr>
-        <w:t xml:space="preserve">جماعي</w:t>
-      </w:r>
-      <w:r>
-        <w:rPr>
-          <w:rFonts w:ascii="Roboto Mono" w:cs="Roboto Mono" w:eastAsia="Roboto Mono" w:hAnsi="Roboto Mono"/>
-          <w:sz w:val="24"/>
-          <w:szCs w:val="24"/>
-          <w:rtl w:val="1"/>
-        </w:rPr>
-        <w:t xml:space="preserve"> (4 </w:t>
-      </w:r>
-      <w:r>
-        <w:rPr>
-          <w:rFonts w:ascii="Jomhuria" w:cs="Jomhuria" w:eastAsia="Jomhuria" w:hAnsi="Jomhuria"/>
-          <w:sz w:val="24"/>
-          <w:szCs w:val="24"/>
-          <w:rtl w:val="1"/>
-        </w:rPr>
-        <w:t xml:space="preserve">أيام</w:t>
-      </w:r>
-      <w:r>
-        <w:rPr>
-          <w:rFonts w:ascii="Nova Mono" w:cs="Nova Mono" w:eastAsia="Nova Mono" w:hAnsi="Nova Mono"/>
-          <w:sz w:val="24"/>
-          <w:szCs w:val="24"/>
-          <w:rtl w:val="1"/>
-        </w:rPr>
-        <w:t xml:space="preserve">) → </w:t>
-      </w:r>
-      <w:r>
-        <w:rPr>
-          <w:rFonts w:ascii="Jomhuria" w:cs="Jomhuria" w:eastAsia="Jomhuria" w:hAnsi="Jomhuria"/>
-          <w:sz w:val="24"/>
-          <w:szCs w:val="24"/>
-          <w:rtl w:val="1"/>
-        </w:rPr>
-        <w:t xml:space="preserve">يوم</w:t>
-      </w:r>
-      <w:r>
-        <w:rPr>
-          <w:rFonts w:ascii="Arial Unicode MS" w:cs="Arial Unicode MS" w:eastAsia="Arial Unicode MS" w:hAnsi="Arial Unicode MS"/>
-          <w:sz w:val="24"/>
-          <w:szCs w:val="24"/>
-          <w:rtl w:val="1"/>
-        </w:rPr>
-        <w:t xml:space="preserve"> 4 ⏰ (10 </w:t>
-      </w:r>
-      <w:r>
-        <w:rPr>
-          <w:rFonts w:ascii="Jomhuria" w:cs="Jomhuria" w:eastAsia="Jomhuria" w:hAnsi="Jomhuria"/>
-          <w:sz w:val="24"/>
-          <w:szCs w:val="24"/>
-          <w:rtl w:val="1"/>
-        </w:rPr>
-        <w:t xml:space="preserve">نقاط</w:t>
-      </w:r>
-      <w:r>
-        <w:rPr>
-          <w:rFonts w:ascii="Roboto Mono" w:cs="Roboto Mono" w:eastAsia="Roboto Mono" w:hAnsi="Roboto Mono"/>
-          <w:sz w:val="24"/>
-          <w:szCs w:val="24"/>
-          <w:rtl w:val="1"/>
-        </w:rPr>
-        <w:t xml:space="preserve">)</w:t>
-      </w:r>
-    </w:p>
-    <w:p>
-      <w:pPr>
-        <w:bidi w:val="1"/>
-        <w:rPr>
-          <w:rFonts w:ascii="Roboto Mono" w:cs="Roboto Mono" w:eastAsia="Roboto Mono" w:hAnsi="Roboto Mono"/>
-          <w:sz w:val="24"/>
-          <w:szCs w:val="24"/>
-        </w:rPr>
-      </w:pPr>
-      <w:r>
-        <w:rPr>
-          <w:rtl w:val="0"/>
-        </w:rPr>
-      </w:r>
-      <w:r>
-        <w:rPr>
-          <w:rFonts w:ascii="Arial Unicode MS" w:cs="Arial Unicode MS" w:eastAsia="Arial Unicode MS" w:hAnsi="Arial Unicode MS"/>
-          <w:sz w:val="24"/>
-          <w:szCs w:val="24"/>
-          <w:rtl w:val="0"/>
-        </w:rPr>
-        <w:t xml:space="preserve">├─ </w:t>
-      </w:r>
-      <w:r>
-        <w:rPr>
-          <w:rFonts w:ascii="Roboto Mono" w:cs="Roboto Mono" w:eastAsia="Roboto Mono" w:hAnsi="Roboto Mono"/>
-          <w:sz w:val="24"/>
-          <w:szCs w:val="24"/>
-          <w:rtl w:val="0"/>
-        </w:rPr>
-        <w:t xml:space="preserve">M</w:t>
-      </w:r>
-      <w:r>
-        <w:rPr>
-          <w:rFonts w:ascii="Roboto Mono" w:cs="Roboto Mono" w:eastAsia="Roboto Mono" w:hAnsi="Roboto Mono"/>
-          <w:sz w:val="24"/>
-          <w:szCs w:val="24"/>
-          <w:rtl w:val="1"/>
-        </w:rPr>
-        <w:t xml:space="preserve">2: </w:t>
-      </w:r>
-      <w:r>
-        <w:rPr>
-          <w:rFonts w:ascii="Jomhuria" w:cs="Jomhuria" w:eastAsia="Jomhuria" w:hAnsi="Jomhuria"/>
-          <w:sz w:val="24"/>
-          <w:szCs w:val="24"/>
-          <w:rtl w:val="1"/>
-        </w:rPr>
-        <w:t xml:space="preserve">مكتبة</w:t>
-      </w:r>
-      <w:r>
-        <w:rPr>
-          <w:rFonts w:ascii="Roboto Mono" w:cs="Roboto Mono" w:eastAsia="Roboto Mono" w:hAnsi="Roboto Mono"/>
-          <w:sz w:val="24"/>
-          <w:szCs w:val="24"/>
-          <w:rtl w:val="1"/>
-        </w:rPr>
-        <w:t xml:space="preserve"> </w:t>
-      </w:r>
-      <w:r>
-        <w:rPr>
-          <w:rFonts w:ascii="Jomhuria" w:cs="Jomhuria" w:eastAsia="Jomhuria" w:hAnsi="Jomhuria"/>
-          <w:sz w:val="24"/>
-          <w:szCs w:val="24"/>
-          <w:rtl w:val="1"/>
-        </w:rPr>
-        <w:t xml:space="preserve">الأمثلة</w:t>
-      </w:r>
-      <w:r>
-        <w:rPr>
-          <w:rFonts w:ascii="Roboto Mono" w:cs="Roboto Mono" w:eastAsia="Roboto Mono" w:hAnsi="Roboto Mono"/>
-          <w:sz w:val="24"/>
-          <w:szCs w:val="24"/>
-          <w:rtl w:val="1"/>
-        </w:rPr>
-        <w:t xml:space="preserve"> (5 </w:t>
-      </w:r>
-      <w:r>
-        <w:rPr>
-          <w:rFonts w:ascii="Jomhuria" w:cs="Jomhuria" w:eastAsia="Jomhuria" w:hAnsi="Jomhuria"/>
-          <w:sz w:val="24"/>
-          <w:szCs w:val="24"/>
-          <w:rtl w:val="1"/>
-        </w:rPr>
-        <w:t xml:space="preserve">أيام</w:t>
-      </w:r>
-      <w:r>
-        <w:rPr>
-          <w:rFonts w:ascii="Nova Mono" w:cs="Nova Mono" w:eastAsia="Nova Mono" w:hAnsi="Nova Mono"/>
-          <w:sz w:val="24"/>
-          <w:szCs w:val="24"/>
-          <w:rtl w:val="1"/>
-        </w:rPr>
-        <w:t xml:space="preserve">) → </w:t>
-      </w:r>
-      <w:r>
-        <w:rPr>
-          <w:rFonts w:ascii="Jomhuria" w:cs="Jomhuria" w:eastAsia="Jomhuria" w:hAnsi="Jomhuria"/>
-          <w:sz w:val="24"/>
-          <w:szCs w:val="24"/>
-          <w:rtl w:val="1"/>
-        </w:rPr>
-        <w:t xml:space="preserve">يوم</w:t>
-      </w:r>
-      <w:r>
-        <w:rPr>
-          <w:rFonts w:ascii="Arial Unicode MS" w:cs="Arial Unicode MS" w:eastAsia="Arial Unicode MS" w:hAnsi="Arial Unicode MS"/>
-          <w:sz w:val="24"/>
-          <w:szCs w:val="24"/>
-          <w:rtl w:val="1"/>
-        </w:rPr>
-        <w:t xml:space="preserve"> 9 ⏰ (20 </w:t>
-      </w:r>
-      <w:r>
-        <w:rPr>
-          <w:rFonts w:ascii="Jomhuria" w:cs="Jomhuria" w:eastAsia="Jomhuria" w:hAnsi="Jomhuria"/>
-          <w:sz w:val="24"/>
-          <w:szCs w:val="24"/>
-          <w:rtl w:val="1"/>
-        </w:rPr>
-        <w:t xml:space="preserve">نقطة</w:t>
-      </w:r>
-      <w:r>
-        <w:rPr>
-          <w:rFonts w:ascii="Roboto Mono" w:cs="Roboto Mono" w:eastAsia="Roboto Mono" w:hAnsi="Roboto Mono"/>
-          <w:sz w:val="24"/>
-          <w:szCs w:val="24"/>
-          <w:rtl w:val="1"/>
-        </w:rPr>
-        <w:t xml:space="preserve">)</w:t>
-      </w:r>
-    </w:p>
-    <w:p>
-      <w:pPr>
-        <w:bidi w:val="1"/>
-        <w:rPr>
-          <w:rFonts w:ascii="Roboto Mono" w:cs="Roboto Mono" w:eastAsia="Roboto Mono" w:hAnsi="Roboto Mono"/>
-          <w:sz w:val="24"/>
-          <w:szCs w:val="24"/>
-        </w:rPr>
-      </w:pPr>
-      <w:r>
-        <w:rPr>
-          <w:rtl w:val="0"/>
-        </w:rPr>
-      </w:r>
-      <w:r>
-        <w:rPr>
-          <w:rFonts w:ascii="Arial Unicode MS" w:cs="Arial Unicode MS" w:eastAsia="Arial Unicode MS" w:hAnsi="Arial Unicode MS"/>
-          <w:sz w:val="24"/>
-          <w:szCs w:val="24"/>
-          <w:rtl w:val="0"/>
-        </w:rPr>
-        <w:t xml:space="preserve">├─ </w:t>
-      </w:r>
-      <w:r>
-        <w:rPr>
-          <w:rFonts w:ascii="Roboto Mono" w:cs="Roboto Mono" w:eastAsia="Roboto Mono" w:hAnsi="Roboto Mono"/>
-          <w:sz w:val="24"/>
-          <w:szCs w:val="24"/>
-          <w:rtl w:val="0"/>
-        </w:rPr>
-        <w:t xml:space="preserve">M</w:t>
-      </w:r>
-      <w:r>
-        <w:rPr>
-          <w:rFonts w:ascii="Roboto Mono" w:cs="Roboto Mono" w:eastAsia="Roboto Mono" w:hAnsi="Roboto Mono"/>
-          <w:sz w:val="24"/>
-          <w:szCs w:val="24"/>
-          <w:rtl w:val="1"/>
-        </w:rPr>
-        <w:t xml:space="preserve">3: </w:t>
-      </w:r>
-      <w:r>
-        <w:rPr>
-          <w:rFonts w:ascii="Jomhuria" w:cs="Jomhuria" w:eastAsia="Jomhuria" w:hAnsi="Jomhuria"/>
-          <w:sz w:val="24"/>
-          <w:szCs w:val="24"/>
-          <w:rtl w:val="1"/>
-        </w:rPr>
-        <w:t xml:space="preserve">التحليلات</w:t>
-      </w:r>
-      <w:r>
-        <w:rPr>
-          <w:rFonts w:ascii="Roboto Mono" w:cs="Roboto Mono" w:eastAsia="Roboto Mono" w:hAnsi="Roboto Mono"/>
-          <w:sz w:val="24"/>
-          <w:szCs w:val="24"/>
-          <w:rtl w:val="1"/>
-        </w:rPr>
-        <w:t xml:space="preserve"> (6 </w:t>
-      </w:r>
-      <w:r>
-        <w:rPr>
-          <w:rFonts w:ascii="Jomhuria" w:cs="Jomhuria" w:eastAsia="Jomhuria" w:hAnsi="Jomhuria"/>
-          <w:sz w:val="24"/>
-          <w:szCs w:val="24"/>
-          <w:rtl w:val="1"/>
-        </w:rPr>
-        <w:t xml:space="preserve">أيام</w:t>
-      </w:r>
-      <w:r>
-        <w:rPr>
-          <w:rFonts w:ascii="Nova Mono" w:cs="Nova Mono" w:eastAsia="Nova Mono" w:hAnsi="Nova Mono"/>
-          <w:sz w:val="24"/>
-          <w:szCs w:val="24"/>
-          <w:rtl w:val="1"/>
-        </w:rPr>
-        <w:t xml:space="preserve">) → </w:t>
-      </w:r>
-      <w:r>
-        <w:rPr>
-          <w:rFonts w:ascii="Jomhuria" w:cs="Jomhuria" w:eastAsia="Jomhuria" w:hAnsi="Jomhuria"/>
-          <w:sz w:val="24"/>
-          <w:szCs w:val="24"/>
-          <w:rtl w:val="1"/>
-        </w:rPr>
-        <w:t xml:space="preserve">يوم</w:t>
-      </w:r>
-      <w:r>
-        <w:rPr>
-          <w:rFonts w:ascii="Arial Unicode MS" w:cs="Arial Unicode MS" w:eastAsia="Arial Unicode MS" w:hAnsi="Arial Unicode MS"/>
-          <w:sz w:val="24"/>
-          <w:szCs w:val="24"/>
-          <w:rtl w:val="1"/>
-        </w:rPr>
-        <w:t xml:space="preserve"> 15 ⏰ (30 </w:t>
-      </w:r>
-      <w:r>
-        <w:rPr>
-          <w:rFonts w:ascii="Jomhuria" w:cs="Jomhuria" w:eastAsia="Jomhuria" w:hAnsi="Jomhuria"/>
-          <w:sz w:val="24"/>
-          <w:szCs w:val="24"/>
-          <w:rtl w:val="1"/>
-        </w:rPr>
-        <w:t xml:space="preserve">نقطة</w:t>
-      </w:r>
-      <w:r>
-        <w:rPr>
-          <w:rFonts w:ascii="Roboto Mono" w:cs="Roboto Mono" w:eastAsia="Roboto Mono" w:hAnsi="Roboto Mono"/>
-          <w:sz w:val="24"/>
-          <w:szCs w:val="24"/>
-          <w:rtl w:val="1"/>
-        </w:rPr>
-        <w:t xml:space="preserve">)</w:t>
-      </w:r>
-    </w:p>
-    <w:p>
-      <w:pPr>
-        <w:bidi w:val="1"/>
-        <w:rPr>
-          <w:rFonts w:ascii="Roboto Mono" w:cs="Roboto Mono" w:eastAsia="Roboto Mono" w:hAnsi="Roboto Mono"/>
-          <w:sz w:val="24"/>
-          <w:szCs w:val="24"/>
-        </w:rPr>
-      </w:pPr>
-      <w:r>
-        <w:rPr>
-          <w:rtl w:val="0"/>
-        </w:rPr>
-      </w:r>
-      <w:r>
-        <w:rPr>
-          <w:rFonts w:ascii="Arial Unicode MS" w:cs="Arial Unicode MS" w:eastAsia="Arial Unicode MS" w:hAnsi="Arial Unicode MS"/>
-          <w:sz w:val="24"/>
-          <w:szCs w:val="24"/>
-          <w:rtl w:val="0"/>
-        </w:rPr>
-        <w:t xml:space="preserve">├─ </w:t>
-      </w:r>
-      <w:r>
-        <w:rPr>
-          <w:rFonts w:ascii="Roboto Mono" w:cs="Roboto Mono" w:eastAsia="Roboto Mono" w:hAnsi="Roboto Mono"/>
-          <w:sz w:val="24"/>
-          <w:szCs w:val="24"/>
-          <w:rtl w:val="0"/>
-        </w:rPr>
-        <w:t xml:space="preserve">M</w:t>
-      </w:r>
-      <w:r>
-        <w:rPr>
-          <w:rFonts w:ascii="Roboto Mono" w:cs="Roboto Mono" w:eastAsia="Roboto Mono" w:hAnsi="Roboto Mono"/>
-          <w:sz w:val="24"/>
-          <w:szCs w:val="24"/>
-          <w:rtl w:val="1"/>
-        </w:rPr>
-        <w:t xml:space="preserve">4: </w:t>
-      </w:r>
-      <w:r>
-        <w:rPr>
-          <w:rFonts w:ascii="Jomhuria" w:cs="Jomhuria" w:eastAsia="Jomhuria" w:hAnsi="Jomhuria"/>
-          <w:sz w:val="24"/>
-          <w:szCs w:val="24"/>
-          <w:rtl w:val="1"/>
-        </w:rPr>
-        <w:t xml:space="preserve">المراجعة</w:t>
-      </w:r>
-      <w:r>
-        <w:rPr>
-          <w:rFonts w:ascii="Roboto Mono" w:cs="Roboto Mono" w:eastAsia="Roboto Mono" w:hAnsi="Roboto Mono"/>
-          <w:sz w:val="24"/>
-          <w:szCs w:val="24"/>
-          <w:rtl w:val="1"/>
-        </w:rPr>
-        <w:t xml:space="preserve"> (3 </w:t>
-      </w:r>
-      <w:r>
-        <w:rPr>
-          <w:rFonts w:ascii="Jomhuria" w:cs="Jomhuria" w:eastAsia="Jomhuria" w:hAnsi="Jomhuria"/>
-          <w:sz w:val="24"/>
-          <w:szCs w:val="24"/>
-          <w:rtl w:val="1"/>
-        </w:rPr>
-        <w:t xml:space="preserve">أيام</w:t>
-      </w:r>
-      <w:r>
-        <w:rPr>
-          <w:rFonts w:ascii="Nova Mono" w:cs="Nova Mono" w:eastAsia="Nova Mono" w:hAnsi="Nova Mono"/>
-          <w:sz w:val="24"/>
-          <w:szCs w:val="24"/>
-          <w:rtl w:val="1"/>
-        </w:rPr>
-        <w:t xml:space="preserve">) → </w:t>
-      </w:r>
-      <w:r>
-        <w:rPr>
-          <w:rFonts w:ascii="Jomhuria" w:cs="Jomhuria" w:eastAsia="Jomhuria" w:hAnsi="Jomhuria"/>
-          <w:sz w:val="24"/>
-          <w:szCs w:val="24"/>
-          <w:rtl w:val="1"/>
-        </w:rPr>
-        <w:t xml:space="preserve">يوم</w:t>
-      </w:r>
-      <w:r>
-        <w:rPr>
-          <w:rFonts w:ascii="Arial Unicode MS" w:cs="Arial Unicode MS" w:eastAsia="Arial Unicode MS" w:hAnsi="Arial Unicode MS"/>
-          <w:sz w:val="24"/>
-          <w:szCs w:val="24"/>
-          <w:rtl w:val="1"/>
-        </w:rPr>
-        <w:t xml:space="preserve"> 18 ⏰ (15 </w:t>
-      </w:r>
-      <w:r>
-        <w:rPr>
-          <w:rFonts w:ascii="Jomhuria" w:cs="Jomhuria" w:eastAsia="Jomhuria" w:hAnsi="Jomhuria"/>
-          <w:sz w:val="24"/>
-          <w:szCs w:val="24"/>
-          <w:rtl w:val="1"/>
-        </w:rPr>
-        <w:t xml:space="preserve">نقطة</w:t>
-      </w:r>
-      <w:r>
-        <w:rPr>
-          <w:rFonts w:ascii="Roboto Mono" w:cs="Roboto Mono" w:eastAsia="Roboto Mono" w:hAnsi="Roboto Mono"/>
-          <w:sz w:val="24"/>
-          <w:szCs w:val="24"/>
-          <w:rtl w:val="1"/>
-        </w:rPr>
-        <w:t xml:space="preserve">)</w:t>
+        <w:t>├─ M1: ملخص جماعي (3 أيام) → يوم 3 ⏰ (10 نقاط)</w:t>
+      </w:r>
+    </w:p>
+    <w:p>
+      <w:pPr>
+        <w:bidi w:val="1"/>
+        <w:rPr>
+          <w:rFonts w:ascii="Roboto Mono" w:cs="Roboto Mono" w:eastAsia="Roboto Mono" w:hAnsi="Roboto Mono"/>
+          <w:sz w:val="24"/>
+          <w:szCs w:val="24"/>
+        </w:rPr>
+      </w:pPr>
+      <w:r>
+        <w:t>├─ M2: مكتبة الأمثلة (5 أيام) → يوم 8 ⏰ (20 نقطة)</w:t>
+      </w:r>
+    </w:p>
+    <w:p>
+      <w:pPr>
+        <w:bidi w:val="1"/>
+        <w:rPr>
+          <w:rFonts w:ascii="Roboto Mono" w:cs="Roboto Mono" w:eastAsia="Roboto Mono" w:hAnsi="Roboto Mono"/>
+          <w:sz w:val="24"/>
+          <w:szCs w:val="24"/>
+        </w:rPr>
+      </w:pPr>
+      <w:r>
+        <w:t>├─ M3: التحليلات (6 أيام) → يوم 14 ⏰ (30 نقطة)</w:t>
+      </w:r>
+    </w:p>
+    <w:p>
+      <w:pPr>
+        <w:bidi w:val="1"/>
+        <w:rPr>
+          <w:rFonts w:ascii="Roboto Mono" w:cs="Roboto Mono" w:eastAsia="Roboto Mono" w:hAnsi="Roboto Mono"/>
+          <w:sz w:val="24"/>
+          <w:szCs w:val="24"/>
+        </w:rPr>
+      </w:pPr>
+      <w:r>
+        <w:t>├─ M4: المراجعة (3 أيام) → يوم 17 ⏰ (15 نقطة)</w:t>
       </w:r>
     </w:p>
     <w:p>
@@ -10884,144 +9919,7 @@
         </w:rPr>
       </w:pPr>
       <w:r>
-        <w:rPr>
-          <w:rtl w:val="0"/>
-        </w:rPr>
-      </w:r>
-      <w:r>
-        <w:rPr>
-          <w:rFonts w:ascii="Roboto" w:cs="Roboto" w:eastAsia="Roboto" w:hAnsi="Roboto"/>
-          <w:sz w:val="24"/>
-          <w:szCs w:val="24"/>
-          <w:rtl w:val="1"/>
-        </w:rPr>
-        <w:t xml:space="preserve">📅 </w:t>
-      </w:r>
-      <w:r>
-        <w:rPr>
-          <w:rFonts w:ascii="Jomhuria" w:cs="Jomhuria" w:eastAsia="Jomhuria" w:hAnsi="Jomhuria"/>
-          <w:sz w:val="24"/>
-          <w:szCs w:val="24"/>
-          <w:rtl w:val="1"/>
-        </w:rPr>
-        <w:t xml:space="preserve">أول</w:t>
-      </w:r>
-      <w:r>
-        <w:rPr>
-          <w:rFonts w:ascii="Roboto" w:cs="Roboto" w:eastAsia="Roboto" w:hAnsi="Roboto"/>
-          <w:sz w:val="24"/>
-          <w:szCs w:val="24"/>
-          <w:rtl w:val="1"/>
-        </w:rPr>
-        <w:t xml:space="preserve"> </w:t>
-      </w:r>
-      <w:r>
-        <w:rPr>
-          <w:rFonts w:ascii="Jomhuria" w:cs="Jomhuria" w:eastAsia="Jomhuria" w:hAnsi="Jomhuria"/>
-          <w:sz w:val="24"/>
-          <w:szCs w:val="24"/>
-          <w:rtl w:val="1"/>
-        </w:rPr>
-        <w:t xml:space="preserve">موعد</w:t>
-      </w:r>
-      <w:r>
-        <w:rPr>
-          <w:rFonts w:ascii="Roboto" w:cs="Roboto" w:eastAsia="Roboto" w:hAnsi="Roboto"/>
-          <w:sz w:val="24"/>
-          <w:szCs w:val="24"/>
-          <w:rtl w:val="1"/>
-        </w:rPr>
-        <w:t xml:space="preserve"> </w:t>
-      </w:r>
-      <w:r>
-        <w:rPr>
-          <w:rFonts w:ascii="Jomhuria" w:cs="Jomhuria" w:eastAsia="Jomhuria" w:hAnsi="Jomhuria"/>
-          <w:sz w:val="24"/>
-          <w:szCs w:val="24"/>
-          <w:rtl w:val="1"/>
-        </w:rPr>
-        <w:t xml:space="preserve">نهائي</w:t>
-      </w:r>
-      <w:r>
-        <w:rPr>
-          <w:rFonts w:ascii="Roboto" w:cs="Roboto" w:eastAsia="Roboto" w:hAnsi="Roboto"/>
-          <w:sz w:val="24"/>
-          <w:szCs w:val="24"/>
-          <w:rtl w:val="1"/>
-        </w:rPr>
-        <w:t xml:space="preserve">: </w:t>
-      </w:r>
-      <w:r>
-        <w:rPr>
-          <w:rFonts w:ascii="Jomhuria" w:cs="Jomhuria" w:eastAsia="Jomhuria" w:hAnsi="Jomhuria"/>
-          <w:sz w:val="24"/>
-          <w:szCs w:val="24"/>
-          <w:rtl w:val="1"/>
-        </w:rPr>
-        <w:t xml:space="preserve">يوم</w:t>
-      </w:r>
-      <w:r>
-        <w:rPr>
-          <w:rFonts w:ascii="Jomhuria" w:cs="Jomhuria" w:eastAsia="Jomhuria" w:hAnsi="Jomhuria"/>
-          <w:sz w:val="24"/>
-          <w:szCs w:val="24"/>
-          <w:rtl w:val="1"/>
-        </w:rPr>
-        <w:t xml:space="preserve"> 4، 11:59 </w:t>
-      </w:r>
-      <w:r>
-        <w:rPr>
-          <w:rFonts w:ascii="Jomhuria" w:cs="Jomhuria" w:eastAsia="Jomhuria" w:hAnsi="Jomhuria"/>
-          <w:sz w:val="24"/>
-          <w:szCs w:val="24"/>
-          <w:rtl w:val="1"/>
-        </w:rPr>
-        <w:t xml:space="preserve">مساء</w:t>
-      </w:r>
-      <w:r>
-        <w:rPr>
-          <w:rFonts w:ascii="Jomhuria" w:cs="Jomhuria" w:eastAsia="Jomhuria" w:hAnsi="Jomhuria"/>
-          <w:sz w:val="24"/>
-          <w:szCs w:val="24"/>
-          <w:rtl w:val="1"/>
-        </w:rPr>
-        <w:t xml:space="preserve">ً - </w:t>
-      </w:r>
-      <w:r>
-        <w:rPr>
-          <w:rFonts w:ascii="Jomhuria" w:cs="Jomhuria" w:eastAsia="Jomhuria" w:hAnsi="Jomhuria"/>
-          <w:sz w:val="24"/>
-          <w:szCs w:val="24"/>
-          <w:rtl w:val="1"/>
-        </w:rPr>
-        <w:t xml:space="preserve">ابدأوا</w:t>
-      </w:r>
-      <w:r>
-        <w:rPr>
-          <w:rFonts w:ascii="Roboto" w:cs="Roboto" w:eastAsia="Roboto" w:hAnsi="Roboto"/>
-          <w:sz w:val="24"/>
-          <w:szCs w:val="24"/>
-          <w:rtl w:val="1"/>
-        </w:rPr>
-        <w:t xml:space="preserve"> </w:t>
-      </w:r>
-      <w:r>
-        <w:rPr>
-          <w:rFonts w:ascii="Jomhuria" w:cs="Jomhuria" w:eastAsia="Jomhuria" w:hAnsi="Jomhuria"/>
-          <w:sz w:val="24"/>
-          <w:szCs w:val="24"/>
-          <w:rtl w:val="1"/>
-        </w:rPr>
-        <w:t xml:space="preserve">الآن</w:t>
-      </w:r>
-      <w:r>
-        <w:rPr>
-          <w:rFonts w:ascii="Roboto" w:cs="Roboto" w:eastAsia="Roboto" w:hAnsi="Roboto"/>
-          <w:sz w:val="24"/>
-          <w:szCs w:val="24"/>
-          <w:rtl w:val="1"/>
-        </w:rPr>
-        <w:t xml:space="preserve">!</w:t>
+        <w:t>📅 أول موعد نهائي: يوم 3، 11:59 مساءً - ابدأوا الآن!</w:t>
       </w:r>
     </w:p>
     <w:p>
@@ -12984,103 +11882,7 @@
         </w:rPr>
       </w:pPr>
       <w:r>
-        <w:rPr>
-          <w:rFonts w:ascii="Jomhuria" w:cs="Jomhuria" w:eastAsia="Jomhuria" w:hAnsi="Jomhuria"/>
-          <w:sz w:val="24"/>
-          <w:szCs w:val="24"/>
-          <w:rtl w:val="1"/>
-        </w:rPr>
-        <w:t xml:space="preserve">العنوان</w:t>
-      </w:r>
-      <w:r>
-        <w:rPr>
-          <w:rFonts w:ascii="Andika" w:cs="Andika" w:eastAsia="Andika" w:hAnsi="Andika"/>
-          <w:sz w:val="24"/>
-          <w:szCs w:val="24"/>
-          <w:rtl w:val="1"/>
-        </w:rPr>
-        <w:t xml:space="preserve">: ⏱️ [4 </w:t>
-      </w:r>
-      <w:r>
-        <w:rPr>
-          <w:rFonts w:ascii="Jomhuria" w:cs="Jomhuria" w:eastAsia="Jomhuria" w:hAnsi="Jomhuria"/>
-          <w:sz w:val="24"/>
-          <w:szCs w:val="24"/>
-          <w:rtl w:val="1"/>
-        </w:rPr>
-        <w:t xml:space="preserve">أيام</w:t>
-      </w:r>
-      <w:r>
-        <w:rPr>
-          <w:rFonts w:ascii="Roboto" w:cs="Roboto" w:eastAsia="Roboto" w:hAnsi="Roboto"/>
-          <w:sz w:val="24"/>
-          <w:szCs w:val="24"/>
-          <w:rtl w:val="1"/>
-        </w:rPr>
-        <w:t xml:space="preserve"> </w:t>
-      </w:r>
-      <w:r>
-        <w:rPr>
-          <w:rFonts w:ascii="Jomhuria" w:cs="Jomhuria" w:eastAsia="Jomhuria" w:hAnsi="Jomhuria"/>
-          <w:sz w:val="24"/>
-          <w:szCs w:val="24"/>
-          <w:rtl w:val="1"/>
-        </w:rPr>
-        <w:t xml:space="preserve">فقط</w:t>
-      </w:r>
-      <w:r>
-        <w:rPr>
-          <w:rFonts w:ascii="Roboto" w:cs="Roboto" w:eastAsia="Roboto" w:hAnsi="Roboto"/>
-          <w:sz w:val="24"/>
-          <w:szCs w:val="24"/>
-          <w:rtl w:val="1"/>
-        </w:rPr>
-        <w:t xml:space="preserve">!] </w:t>
-      </w:r>
-      <w:r>
-        <w:rPr>
-          <w:rFonts w:ascii="Jomhuria" w:cs="Jomhuria" w:eastAsia="Jomhuria" w:hAnsi="Jomhuria"/>
-          <w:sz w:val="24"/>
-          <w:szCs w:val="24"/>
-          <w:rtl w:val="1"/>
-        </w:rPr>
-        <w:t xml:space="preserve">ملخص</w:t>
-      </w:r>
-      <w:r>
-        <w:rPr>
-          <w:rFonts w:ascii="Roboto" w:cs="Roboto" w:eastAsia="Roboto" w:hAnsi="Roboto"/>
-          <w:sz w:val="24"/>
-          <w:szCs w:val="24"/>
-          <w:rtl w:val="1"/>
-        </w:rPr>
-        <w:t xml:space="preserve"> </w:t>
-      </w:r>
-      <w:r>
-        <w:rPr>
-          <w:rFonts w:ascii="Jomhuria" w:cs="Jomhuria" w:eastAsia="Jomhuria" w:hAnsi="Jomhuria"/>
-          <w:sz w:val="24"/>
-          <w:szCs w:val="24"/>
-          <w:rtl w:val="1"/>
-        </w:rPr>
-        <w:t xml:space="preserve">جماعي</w:t>
-      </w:r>
-      <w:r>
-        <w:rPr>
-          <w:rFonts w:ascii="Roboto" w:cs="Roboto" w:eastAsia="Roboto" w:hAnsi="Roboto"/>
-          <w:sz w:val="24"/>
-          <w:szCs w:val="24"/>
-          <w:rtl w:val="1"/>
-        </w:rPr>
-        <w:t xml:space="preserve"> </w:t>
-      </w:r>
-      <w:r>
-        <w:rPr>
-          <w:rFonts w:ascii="Jomhuria" w:cs="Jomhuria" w:eastAsia="Jomhuria" w:hAnsi="Jomhuria"/>
-          <w:sz w:val="24"/>
-          <w:szCs w:val="24"/>
-          <w:rtl w:val="1"/>
-        </w:rPr>
-        <w:t xml:space="preserve">للمعايير</w:t>
+        <w:t>العنوان: ⏱️ [3 أيام فقط!] ملخص جماعي للمعايير</w:t>
       </w:r>
     </w:p>
     <w:p>
@@ -13186,72 +11988,7 @@
         </w:rPr>
       </w:pPr>
       <w:r>
-        <w:rPr>
-          <w:rtl w:val="0"/>
-        </w:rPr>
-      </w:r>
-      <w:r>
-        <w:rPr>
-          <w:rFonts w:ascii="Arial Unicode MS" w:cs="Arial Unicode MS" w:eastAsia="Arial Unicode MS" w:hAnsi="Arial Unicode MS"/>
-          <w:sz w:val="24"/>
-          <w:szCs w:val="24"/>
-          <w:rtl w:val="1"/>
-        </w:rPr>
-        <w:t xml:space="preserve">✅ </w:t>
-      </w:r>
-      <w:r>
-        <w:rPr>
-          <w:rFonts w:ascii="Jomhuria" w:cs="Jomhuria" w:eastAsia="Jomhuria" w:hAnsi="Jomhuria"/>
-          <w:sz w:val="24"/>
-          <w:szCs w:val="24"/>
-          <w:rtl w:val="1"/>
-        </w:rPr>
-        <w:t xml:space="preserve">اليوم</w:t>
-      </w:r>
-      <w:r>
-        <w:rPr>
-          <w:rFonts w:ascii="Jomhuria" w:cs="Jomhuria" w:eastAsia="Jomhuria" w:hAnsi="Jomhuria"/>
-          <w:sz w:val="24"/>
-          <w:szCs w:val="24"/>
-          <w:rtl w:val="1"/>
-        </w:rPr>
-        <w:t xml:space="preserve"> 4، </w:t>
-      </w:r>
-      <w:r>
-        <w:rPr>
-          <w:rFonts w:ascii="Jomhuria" w:cs="Jomhuria" w:eastAsia="Jomhuria" w:hAnsi="Jomhuria"/>
-          <w:sz w:val="24"/>
-          <w:szCs w:val="24"/>
-          <w:rtl w:val="1"/>
-        </w:rPr>
-        <w:t xml:space="preserve">الساعة</w:t>
-      </w:r>
-      <w:r>
-        <w:rPr>
-          <w:rFonts w:ascii="Roboto" w:cs="Roboto" w:eastAsia="Roboto" w:hAnsi="Roboto"/>
-          <w:sz w:val="24"/>
-          <w:szCs w:val="24"/>
-          <w:rtl w:val="1"/>
-        </w:rPr>
-        <w:t xml:space="preserve"> 11:59 </w:t>
-      </w:r>
-      <w:r>
-        <w:rPr>
-          <w:rFonts w:ascii="Jomhuria" w:cs="Jomhuria" w:eastAsia="Jomhuria" w:hAnsi="Jomhuria"/>
-          <w:sz w:val="24"/>
-          <w:szCs w:val="24"/>
-          <w:rtl w:val="1"/>
-        </w:rPr>
-        <w:t xml:space="preserve">مساء</w:t>
-      </w:r>
-      <w:r>
-        <w:rPr>
-          <w:rFonts w:ascii="Jomhuria" w:cs="Jomhuria" w:eastAsia="Jomhuria" w:hAnsi="Jomhuria"/>
-          <w:sz w:val="24"/>
-          <w:szCs w:val="24"/>
-          <w:rtl w:val="1"/>
-        </w:rPr>
-        <w:t xml:space="preserve">ً</w:t>
+        <w:t>✅ اليوم 3، الساعة 11:59 مساءً</w:t>
       </w:r>
     </w:p>
     <w:p>
@@ -13365,142 +12102,377 @@
           <w:szCs w:val="36"/>
         </w:rPr>
       </w:pPr>
-      <w:bookmarkStart w:colFirst="0" w:colLast="0" w:name="_rsch6vd0h34u" w:id="26"/>
-      <w:bookmarkEnd w:id="26"/>
-      <w:r>
-        <w:rPr>
+      <w:r>
+        <w:t>⏰ خطة زمنية مقترحة للفريق (3 أيام):</w:t>
+      </w:r>
+    </w:p>
+    <w:p>
+      <w:pPr>
+        <w:bidi w:val="1"/>
+        <w:spacing w:after="240" w:before="0" w:line="390" w:lineRule="auto"/>
+        <w:rPr>
+          <w:rFonts w:ascii="Courier New" w:cs="Courier New" w:eastAsia="Courier New" w:hAnsi="Courier New"/>
+          <w:sz w:val="24"/>
+          <w:szCs w:val="24"/>
+        </w:rPr>
+      </w:pPr>
+      <w:r>
+        <w:rPr>
+          <w:rFonts w:ascii="Courier New" w:cs="Courier New" w:eastAsia="Courier New" w:hAnsi="Courier New"/>
+          <w:sz w:val="24"/>
+          <w:szCs w:val="24"/>
           <w:rtl w:val="0"/>
         </w:rPr>
+        <w:t xml:space="preserve">text</w:t>
+      </w:r>
+    </w:p>
+    <w:p>
+      <w:pPr>
+        <w:bidi w:val="1"/>
+        <w:rPr>
+          <w:rFonts w:ascii="Roboto Mono" w:cs="Roboto Mono" w:eastAsia="Roboto Mono" w:hAnsi="Roboto Mono"/>
+          <w:sz w:val="24"/>
+          <w:szCs w:val="24"/>
+        </w:rPr>
+      </w:pPr>
+      <w:r>
+        <w:rPr>
+          <w:rFonts w:ascii="Jomhuria" w:cs="Jomhuria" w:eastAsia="Jomhuria" w:hAnsi="Jomhuria"/>
+          <w:sz w:val="24"/>
+          <w:szCs w:val="24"/>
+          <w:rtl w:val="1"/>
+        </w:rPr>
+        <w:t xml:space="preserve">اليوم</w:t>
+      </w:r>
+      <w:r>
+        <w:rPr>
+          <w:rFonts w:ascii="Roboto Mono" w:cs="Roboto Mono" w:eastAsia="Roboto Mono" w:hAnsi="Roboto Mono"/>
+          <w:sz w:val="24"/>
+          <w:szCs w:val="24"/>
+          <w:rtl w:val="1"/>
+        </w:rPr>
+        <w:t xml:space="preserve"> 1:</w:t>
+      </w:r>
+    </w:p>
+    <w:p>
+      <w:pPr>
+        <w:bidi w:val="1"/>
+        <w:rPr>
+          <w:rFonts w:ascii="Roboto Mono" w:cs="Roboto Mono" w:eastAsia="Roboto Mono" w:hAnsi="Roboto Mono"/>
+          <w:sz w:val="24"/>
+          <w:szCs w:val="24"/>
+        </w:rPr>
+      </w:pPr>
+      <w:r>
+        <w:rPr>
+          <w:rtl w:val="0"/>
+        </w:rPr>
       </w:r>
       <w:r>
         <w:rPr>
           <w:rFonts w:ascii="Arial Unicode MS" w:cs="Arial Unicode MS" w:eastAsia="Arial Unicode MS" w:hAnsi="Arial Unicode MS"/>
-          <w:b w:val="1"/>
-          <w:sz w:val="36"/>
-          <w:szCs w:val="36"/>
-          <w:rtl w:val="1"/>
-        </w:rPr>
-        <w:t xml:space="preserve">⏰ </w:t>
-      </w:r>
-      <w:r>
-        <w:rPr>
-          <w:rFonts w:ascii="Jomhuria" w:cs="Jomhuria" w:eastAsia="Jomhuria" w:hAnsi="Jomhuria"/>
-          <w:b w:val="1"/>
-          <w:sz w:val="36"/>
-          <w:szCs w:val="36"/>
-          <w:rtl w:val="1"/>
-        </w:rPr>
-        <w:t xml:space="preserve">خطة</w:t>
-      </w:r>
-      <w:r>
-        <w:rPr>
-          <w:rFonts w:ascii="Roboto" w:cs="Roboto" w:eastAsia="Roboto" w:hAnsi="Roboto"/>
-          <w:b w:val="1"/>
-          <w:sz w:val="36"/>
-          <w:szCs w:val="36"/>
-          <w:rtl w:val="1"/>
-        </w:rPr>
-        <w:t xml:space="preserve"> </w:t>
-      </w:r>
-      <w:r>
-        <w:rPr>
-          <w:rFonts w:ascii="Jomhuria" w:cs="Jomhuria" w:eastAsia="Jomhuria" w:hAnsi="Jomhuria"/>
-          <w:b w:val="1"/>
-          <w:sz w:val="36"/>
-          <w:szCs w:val="36"/>
-          <w:rtl w:val="1"/>
-        </w:rPr>
-        <w:t xml:space="preserve">زمنية</w:t>
-      </w:r>
-      <w:r>
-        <w:rPr>
-          <w:rFonts w:ascii="Roboto" w:cs="Roboto" w:eastAsia="Roboto" w:hAnsi="Roboto"/>
-          <w:b w:val="1"/>
-          <w:sz w:val="36"/>
-          <w:szCs w:val="36"/>
-          <w:rtl w:val="1"/>
-        </w:rPr>
-        <w:t xml:space="preserve"> </w:t>
-      </w:r>
-      <w:r>
-        <w:rPr>
-          <w:rFonts w:ascii="Jomhuria" w:cs="Jomhuria" w:eastAsia="Jomhuria" w:hAnsi="Jomhuria"/>
-          <w:b w:val="1"/>
-          <w:sz w:val="36"/>
-          <w:szCs w:val="36"/>
-          <w:rtl w:val="1"/>
-        </w:rPr>
-        <w:t xml:space="preserve">مقترحة</w:t>
-      </w:r>
-      <w:r>
-        <w:rPr>
-          <w:rFonts w:ascii="Roboto" w:cs="Roboto" w:eastAsia="Roboto" w:hAnsi="Roboto"/>
-          <w:b w:val="1"/>
-          <w:sz w:val="36"/>
-          <w:szCs w:val="36"/>
-          <w:rtl w:val="1"/>
-        </w:rPr>
-        <w:t xml:space="preserve"> </w:t>
-      </w:r>
-      <w:r>
-        <w:rPr>
-          <w:rFonts w:ascii="Jomhuria" w:cs="Jomhuria" w:eastAsia="Jomhuria" w:hAnsi="Jomhuria"/>
-          <w:b w:val="1"/>
-          <w:sz w:val="36"/>
-          <w:szCs w:val="36"/>
-          <w:rtl w:val="1"/>
-        </w:rPr>
-        <w:t xml:space="preserve">للفريق</w:t>
-      </w:r>
-      <w:r>
-        <w:rPr>
-          <w:rFonts w:ascii="Roboto" w:cs="Roboto" w:eastAsia="Roboto" w:hAnsi="Roboto"/>
-          <w:b w:val="1"/>
-          <w:sz w:val="36"/>
-          <w:szCs w:val="36"/>
-          <w:rtl w:val="1"/>
-        </w:rPr>
-        <w:t xml:space="preserve"> (4 </w:t>
-      </w:r>
-      <w:r>
-        <w:rPr>
-          <w:rFonts w:ascii="Jomhuria" w:cs="Jomhuria" w:eastAsia="Jomhuria" w:hAnsi="Jomhuria"/>
-          <w:b w:val="1"/>
-          <w:sz w:val="36"/>
-          <w:szCs w:val="36"/>
-          <w:rtl w:val="1"/>
-        </w:rPr>
-        <w:t xml:space="preserve">أيام</w:t>
-      </w:r>
-      <w:r>
-        <w:rPr>
-          <w:rFonts w:ascii="Roboto" w:cs="Roboto" w:eastAsia="Roboto" w:hAnsi="Roboto"/>
-          <w:b w:val="1"/>
-          <w:sz w:val="36"/>
-          <w:szCs w:val="36"/>
-          <w:rtl w:val="1"/>
-        </w:rPr>
-        <w:t xml:space="preserve">):</w:t>
-      </w:r>
-    </w:p>
-    <w:p>
-      <w:pPr>
-        <w:bidi w:val="1"/>
-        <w:spacing w:after="240" w:before="0" w:line="390" w:lineRule="auto"/>
-        <w:rPr>
-          <w:rFonts w:ascii="Courier New" w:cs="Courier New" w:eastAsia="Courier New" w:hAnsi="Courier New"/>
-          <w:sz w:val="24"/>
-          <w:szCs w:val="24"/>
-        </w:rPr>
-      </w:pPr>
-      <w:r>
-        <w:rPr>
-          <w:rFonts w:ascii="Courier New" w:cs="Courier New" w:eastAsia="Courier New" w:hAnsi="Courier New"/>
-          <w:sz w:val="24"/>
-          <w:szCs w:val="24"/>
+          <w:sz w:val="24"/>
+          <w:szCs w:val="24"/>
+          <w:rtl w:val="1"/>
+        </w:rPr>
+        <w:t xml:space="preserve">├─ </w:t>
+      </w:r>
+      <w:r>
+        <w:rPr>
+          <w:rFonts w:ascii="Jomhuria" w:cs="Jomhuria" w:eastAsia="Jomhuria" w:hAnsi="Jomhuria"/>
+          <w:sz w:val="24"/>
+          <w:szCs w:val="24"/>
+          <w:rtl w:val="1"/>
+        </w:rPr>
+        <w:t xml:space="preserve">الساعة</w:t>
+      </w:r>
+      <w:r>
+        <w:rPr>
+          <w:rFonts w:ascii="Roboto Mono" w:cs="Roboto Mono" w:eastAsia="Roboto Mono" w:hAnsi="Roboto Mono"/>
+          <w:sz w:val="24"/>
+          <w:szCs w:val="24"/>
+          <w:rtl w:val="1"/>
+        </w:rPr>
+        <w:t xml:space="preserve"> 9-12: </w:t>
+      </w:r>
+      <w:r>
+        <w:rPr>
+          <w:rFonts w:ascii="Jomhuria" w:cs="Jomhuria" w:eastAsia="Jomhuria" w:hAnsi="Jomhuria"/>
+          <w:sz w:val="24"/>
+          <w:szCs w:val="24"/>
+          <w:rtl w:val="1"/>
+        </w:rPr>
+        <w:t xml:space="preserve">قراءة</w:t>
+      </w:r>
+      <w:r>
+        <w:rPr>
+          <w:rFonts w:ascii="Roboto Mono" w:cs="Roboto Mono" w:eastAsia="Roboto Mono" w:hAnsi="Roboto Mono"/>
+          <w:sz w:val="24"/>
+          <w:szCs w:val="24"/>
+          <w:rtl w:val="1"/>
+        </w:rPr>
+        <w:t xml:space="preserve"> </w:t>
+      </w:r>
+      <w:r>
+        <w:rPr>
+          <w:rFonts w:ascii="Jomhuria" w:cs="Jomhuria" w:eastAsia="Jomhuria" w:hAnsi="Jomhuria"/>
+          <w:sz w:val="24"/>
+          <w:szCs w:val="24"/>
+          <w:rtl w:val="1"/>
+        </w:rPr>
+        <w:t xml:space="preserve">فردية</w:t>
+      </w:r>
+      <w:r>
+        <w:rPr>
+          <w:rFonts w:ascii="Roboto Mono" w:cs="Roboto Mono" w:eastAsia="Roboto Mono" w:hAnsi="Roboto Mono"/>
+          <w:sz w:val="24"/>
+          <w:szCs w:val="24"/>
+          <w:rtl w:val="1"/>
+        </w:rPr>
+        <w:t xml:space="preserve"> (</w:t>
+      </w:r>
+      <w:r>
+        <w:rPr>
+          <w:rFonts w:ascii="Jomhuria" w:cs="Jomhuria" w:eastAsia="Jomhuria" w:hAnsi="Jomhuria"/>
+          <w:sz w:val="24"/>
+          <w:szCs w:val="24"/>
+          <w:rtl w:val="1"/>
+        </w:rPr>
+        <w:t xml:space="preserve">كل</w:t>
+      </w:r>
+      <w:r>
+        <w:rPr>
+          <w:rFonts w:ascii="Roboto Mono" w:cs="Roboto Mono" w:eastAsia="Roboto Mono" w:hAnsi="Roboto Mono"/>
+          <w:sz w:val="24"/>
+          <w:szCs w:val="24"/>
+          <w:rtl w:val="1"/>
+        </w:rPr>
+        <w:t xml:space="preserve"> </w:t>
+      </w:r>
+      <w:r>
+        <w:rPr>
+          <w:rFonts w:ascii="Jomhuria" w:cs="Jomhuria" w:eastAsia="Jomhuria" w:hAnsi="Jomhuria"/>
+          <w:sz w:val="24"/>
+          <w:szCs w:val="24"/>
+          <w:rtl w:val="1"/>
+        </w:rPr>
+        <w:t xml:space="preserve">عضو</w:t>
+      </w:r>
+      <w:r>
+        <w:rPr>
+          <w:rFonts w:ascii="Roboto Mono" w:cs="Roboto Mono" w:eastAsia="Roboto Mono" w:hAnsi="Roboto Mono"/>
+          <w:sz w:val="24"/>
+          <w:szCs w:val="24"/>
+          <w:rtl w:val="1"/>
+        </w:rPr>
+        <w:t xml:space="preserve">)</w:t>
+      </w:r>
+    </w:p>
+    <w:p>
+      <w:pPr>
+        <w:bidi w:val="1"/>
+        <w:rPr>
+          <w:rFonts w:ascii="Roboto Mono" w:cs="Roboto Mono" w:eastAsia="Roboto Mono" w:hAnsi="Roboto Mono"/>
+          <w:sz w:val="24"/>
+          <w:szCs w:val="24"/>
+        </w:rPr>
+      </w:pPr>
+      <w:r>
+        <w:rPr>
           <w:rtl w:val="0"/>
         </w:rPr>
-        <w:t xml:space="preserve">text</w:t>
+      </w:r>
+      <w:r>
+        <w:rPr>
+          <w:rFonts w:ascii="Arial Unicode MS" w:cs="Arial Unicode MS" w:eastAsia="Arial Unicode MS" w:hAnsi="Arial Unicode MS"/>
+          <w:sz w:val="24"/>
+          <w:szCs w:val="24"/>
+          <w:rtl w:val="1"/>
+        </w:rPr>
+        <w:t xml:space="preserve">├─ </w:t>
+      </w:r>
+      <w:r>
+        <w:rPr>
+          <w:rFonts w:ascii="Jomhuria" w:cs="Jomhuria" w:eastAsia="Jomhuria" w:hAnsi="Jomhuria"/>
+          <w:sz w:val="24"/>
+          <w:szCs w:val="24"/>
+          <w:rtl w:val="1"/>
+        </w:rPr>
+        <w:t xml:space="preserve">الساعة</w:t>
+      </w:r>
+      <w:r>
+        <w:rPr>
+          <w:rFonts w:ascii="Roboto Mono" w:cs="Roboto Mono" w:eastAsia="Roboto Mono" w:hAnsi="Roboto Mono"/>
+          <w:sz w:val="24"/>
+          <w:szCs w:val="24"/>
+          <w:rtl w:val="1"/>
+        </w:rPr>
+        <w:t xml:space="preserve"> 7-8: </w:t>
+      </w:r>
+      <w:r>
+        <w:rPr>
+          <w:rFonts w:ascii="Jomhuria" w:cs="Jomhuria" w:eastAsia="Jomhuria" w:hAnsi="Jomhuria"/>
+          <w:sz w:val="24"/>
+          <w:szCs w:val="24"/>
+          <w:rtl w:val="1"/>
+        </w:rPr>
+        <w:t xml:space="preserve">اجتماع</w:t>
+      </w:r>
+      <w:r>
+        <w:rPr>
+          <w:rFonts w:ascii="Roboto Mono" w:cs="Roboto Mono" w:eastAsia="Roboto Mono" w:hAnsi="Roboto Mono"/>
+          <w:sz w:val="24"/>
+          <w:szCs w:val="24"/>
+          <w:rtl w:val="1"/>
+        </w:rPr>
+        <w:t xml:space="preserve"> </w:t>
+      </w:r>
+      <w:r>
+        <w:rPr>
+          <w:rFonts w:ascii="Jomhuria" w:cs="Jomhuria" w:eastAsia="Jomhuria" w:hAnsi="Jomhuria"/>
+          <w:sz w:val="24"/>
+          <w:szCs w:val="24"/>
+          <w:rtl w:val="1"/>
+        </w:rPr>
+        <w:t xml:space="preserve">توزيع</w:t>
+      </w:r>
+      <w:r>
+        <w:rPr>
+          <w:rFonts w:ascii="Roboto Mono" w:cs="Roboto Mono" w:eastAsia="Roboto Mono" w:hAnsi="Roboto Mono"/>
+          <w:sz w:val="24"/>
+          <w:szCs w:val="24"/>
+          <w:rtl w:val="1"/>
+        </w:rPr>
+        <w:t xml:space="preserve"> </w:t>
+      </w:r>
+      <w:r>
+        <w:rPr>
+          <w:rFonts w:ascii="Jomhuria" w:cs="Jomhuria" w:eastAsia="Jomhuria" w:hAnsi="Jomhuria"/>
+          <w:sz w:val="24"/>
+          <w:szCs w:val="24"/>
+          <w:rtl w:val="1"/>
+        </w:rPr>
+        <w:t xml:space="preserve">المهام</w:t>
+      </w:r>
+    </w:p>
+    <w:p>
+      <w:pPr>
+        <w:bidi w:val="1"/>
+        <w:rPr>
+          <w:rFonts w:ascii="Roboto Mono" w:cs="Roboto Mono" w:eastAsia="Roboto Mono" w:hAnsi="Roboto Mono"/>
+          <w:sz w:val="24"/>
+          <w:szCs w:val="24"/>
+        </w:rPr>
+      </w:pPr>
+      <w:r>
+        <w:rPr>
+          <w:rtl w:val="0"/>
+        </w:rPr>
+      </w:r>
+      <w:r>
+        <w:rPr>
+          <w:rFonts w:ascii="Arial Unicode MS" w:cs="Arial Unicode MS" w:eastAsia="Arial Unicode MS" w:hAnsi="Arial Unicode MS"/>
+          <w:sz w:val="24"/>
+          <w:szCs w:val="24"/>
+          <w:rtl w:val="1"/>
+        </w:rPr>
+        <w:t xml:space="preserve">└─ </w:t>
+      </w:r>
+      <w:r>
+        <w:rPr>
+          <w:rFonts w:ascii="Jomhuria" w:cs="Jomhuria" w:eastAsia="Jomhuria" w:hAnsi="Jomhuria"/>
+          <w:sz w:val="24"/>
+          <w:szCs w:val="24"/>
+          <w:rtl w:val="1"/>
+        </w:rPr>
+        <w:t xml:space="preserve">الساعة</w:t>
+      </w:r>
+      <w:r>
+        <w:rPr>
+          <w:rFonts w:ascii="Roboto Mono" w:cs="Roboto Mono" w:eastAsia="Roboto Mono" w:hAnsi="Roboto Mono"/>
+          <w:sz w:val="24"/>
+          <w:szCs w:val="24"/>
+          <w:rtl w:val="1"/>
+        </w:rPr>
+        <w:t xml:space="preserve"> 8-10: </w:t>
+      </w:r>
+      <w:r>
+        <w:rPr>
+          <w:rFonts w:ascii="Jomhuria" w:cs="Jomhuria" w:eastAsia="Jomhuria" w:hAnsi="Jomhuria"/>
+          <w:sz w:val="24"/>
+          <w:szCs w:val="24"/>
+          <w:rtl w:val="1"/>
+        </w:rPr>
+        <w:t xml:space="preserve">كل</w:t>
+      </w:r>
+      <w:r>
+        <w:rPr>
+          <w:rFonts w:ascii="Roboto Mono" w:cs="Roboto Mono" w:eastAsia="Roboto Mono" w:hAnsi="Roboto Mono"/>
+          <w:sz w:val="24"/>
+          <w:szCs w:val="24"/>
+          <w:rtl w:val="1"/>
+        </w:rPr>
+        <w:t xml:space="preserve"> </w:t>
+      </w:r>
+      <w:r>
+        <w:rPr>
+          <w:rFonts w:ascii="Jomhuria" w:cs="Jomhuria" w:eastAsia="Jomhuria" w:hAnsi="Jomhuria"/>
+          <w:sz w:val="24"/>
+          <w:szCs w:val="24"/>
+          <w:rtl w:val="1"/>
+        </w:rPr>
+        <w:t xml:space="preserve">عضو</w:t>
+      </w:r>
+      <w:r>
+        <w:rPr>
+          <w:rFonts w:ascii="Roboto Mono" w:cs="Roboto Mono" w:eastAsia="Roboto Mono" w:hAnsi="Roboto Mono"/>
+          <w:sz w:val="24"/>
+          <w:szCs w:val="24"/>
+          <w:rtl w:val="1"/>
+        </w:rPr>
+        <w:t xml:space="preserve"> </w:t>
+      </w:r>
+      <w:r>
+        <w:rPr>
+          <w:rFonts w:ascii="Jomhuria" w:cs="Jomhuria" w:eastAsia="Jomhuria" w:hAnsi="Jomhuria"/>
+          <w:sz w:val="24"/>
+          <w:szCs w:val="24"/>
+          <w:rtl w:val="1"/>
+        </w:rPr>
+        <w:t xml:space="preserve">يبدأ</w:t>
+      </w:r>
+      <w:r>
+        <w:rPr>
+          <w:rFonts w:ascii="Roboto Mono" w:cs="Roboto Mono" w:eastAsia="Roboto Mono" w:hAnsi="Roboto Mono"/>
+          <w:sz w:val="24"/>
+          <w:szCs w:val="24"/>
+          <w:rtl w:val="1"/>
+        </w:rPr>
+        <w:t xml:space="preserve"> </w:t>
+      </w:r>
+      <w:r>
+        <w:rPr>
+          <w:rFonts w:ascii="Jomhuria" w:cs="Jomhuria" w:eastAsia="Jomhuria" w:hAnsi="Jomhuria"/>
+          <w:sz w:val="24"/>
+          <w:szCs w:val="24"/>
+          <w:rtl w:val="1"/>
+        </w:rPr>
+        <w:t xml:space="preserve">جزءه</w:t>
+      </w:r>
+    </w:p>
+    <w:p>
+      <w:pPr>
+        <w:bidi w:val="1"/>
+        <w:rPr>
+          <w:rFonts w:ascii="Roboto Mono" w:cs="Roboto Mono" w:eastAsia="Roboto Mono" w:hAnsi="Roboto Mono"/>
+          <w:sz w:val="24"/>
+          <w:szCs w:val="24"/>
+        </w:rPr>
+      </w:pPr>
+      <w:r>
+        <w:rPr>
+          <w:rtl w:val="0"/>
+        </w:rPr>
       </w:r>
     </w:p>
     <w:p>
@@ -13528,7 +12500,7 @@
           <w:szCs w:val="24"/>
           <w:rtl w:val="1"/>
         </w:rPr>
-        <w:t xml:space="preserve"> 1:</w:t>
+        <w:t xml:space="preserve"> 2-3:</w:t>
       </w:r>
     </w:p>
     <w:p>
@@ -13552,97 +12524,106 @@
           <w:szCs w:val="24"/>
           <w:rtl w:val="1"/>
         </w:rPr>
-        <w:t xml:space="preserve">├─ </w:t>
-      </w:r>
-      <w:r>
-        <w:rPr>
-          <w:rFonts w:ascii="Jomhuria" w:cs="Jomhuria" w:eastAsia="Jomhuria" w:hAnsi="Jomhuria"/>
-          <w:sz w:val="24"/>
-          <w:szCs w:val="24"/>
-          <w:rtl w:val="1"/>
-        </w:rPr>
-        <w:t xml:space="preserve">الساعة</w:t>
-      </w:r>
-      <w:r>
-        <w:rPr>
-          <w:rFonts w:ascii="Roboto Mono" w:cs="Roboto Mono" w:eastAsia="Roboto Mono" w:hAnsi="Roboto Mono"/>
-          <w:sz w:val="24"/>
-          <w:szCs w:val="24"/>
-          <w:rtl w:val="1"/>
-        </w:rPr>
-        <w:t xml:space="preserve"> 9-12: </w:t>
-      </w:r>
-      <w:r>
-        <w:rPr>
-          <w:rFonts w:ascii="Jomhuria" w:cs="Jomhuria" w:eastAsia="Jomhuria" w:hAnsi="Jomhuria"/>
-          <w:sz w:val="24"/>
-          <w:szCs w:val="24"/>
-          <w:rtl w:val="1"/>
-        </w:rPr>
-        <w:t xml:space="preserve">قراءة</w:t>
-      </w:r>
-      <w:r>
-        <w:rPr>
-          <w:rFonts w:ascii="Roboto Mono" w:cs="Roboto Mono" w:eastAsia="Roboto Mono" w:hAnsi="Roboto Mono"/>
-          <w:sz w:val="24"/>
-          <w:szCs w:val="24"/>
-          <w:rtl w:val="1"/>
-        </w:rPr>
-        <w:t xml:space="preserve"> </w:t>
-      </w:r>
-      <w:r>
-        <w:rPr>
-          <w:rFonts w:ascii="Jomhuria" w:cs="Jomhuria" w:eastAsia="Jomhuria" w:hAnsi="Jomhuria"/>
-          <w:sz w:val="24"/>
-          <w:szCs w:val="24"/>
-          <w:rtl w:val="1"/>
-        </w:rPr>
-        <w:t xml:space="preserve">فردية</w:t>
-      </w:r>
-      <w:r>
-        <w:rPr>
-          <w:rFonts w:ascii="Roboto Mono" w:cs="Roboto Mono" w:eastAsia="Roboto Mono" w:hAnsi="Roboto Mono"/>
-          <w:sz w:val="24"/>
-          <w:szCs w:val="24"/>
-          <w:rtl w:val="1"/>
-        </w:rPr>
-        <w:t xml:space="preserve"> (</w:t>
-      </w:r>
-      <w:r>
-        <w:rPr>
-          <w:rFonts w:ascii="Jomhuria" w:cs="Jomhuria" w:eastAsia="Jomhuria" w:hAnsi="Jomhuria"/>
-          <w:sz w:val="24"/>
-          <w:szCs w:val="24"/>
-          <w:rtl w:val="1"/>
-        </w:rPr>
-        <w:t xml:space="preserve">كل</w:t>
-      </w:r>
-      <w:r>
-        <w:rPr>
-          <w:rFonts w:ascii="Roboto Mono" w:cs="Roboto Mono" w:eastAsia="Roboto Mono" w:hAnsi="Roboto Mono"/>
-          <w:sz w:val="24"/>
-          <w:szCs w:val="24"/>
-          <w:rtl w:val="1"/>
-        </w:rPr>
-        <w:t xml:space="preserve"> </w:t>
-      </w:r>
-      <w:r>
-        <w:rPr>
-          <w:rFonts w:ascii="Jomhuria" w:cs="Jomhuria" w:eastAsia="Jomhuria" w:hAnsi="Jomhuria"/>
-          <w:sz w:val="24"/>
-          <w:szCs w:val="24"/>
-          <w:rtl w:val="1"/>
-        </w:rPr>
-        <w:t xml:space="preserve">عضو</w:t>
-      </w:r>
-      <w:r>
-        <w:rPr>
-          <w:rFonts w:ascii="Roboto Mono" w:cs="Roboto Mono" w:eastAsia="Roboto Mono" w:hAnsi="Roboto Mono"/>
-          <w:sz w:val="24"/>
-          <w:szCs w:val="24"/>
-          <w:rtl w:val="1"/>
-        </w:rPr>
-        <w:t xml:space="preserve">)</w:t>
+        <w:t xml:space="preserve">└─ </w:t>
+      </w:r>
+      <w:r>
+        <w:rPr>
+          <w:rFonts w:ascii="Jomhuria" w:cs="Jomhuria" w:eastAsia="Jomhuria" w:hAnsi="Jomhuria"/>
+          <w:sz w:val="24"/>
+          <w:szCs w:val="24"/>
+          <w:rtl w:val="1"/>
+        </w:rPr>
+        <w:t xml:space="preserve">عمل</w:t>
+      </w:r>
+      <w:r>
+        <w:rPr>
+          <w:rFonts w:ascii="Roboto Mono" w:cs="Roboto Mono" w:eastAsia="Roboto Mono" w:hAnsi="Roboto Mono"/>
+          <w:sz w:val="24"/>
+          <w:szCs w:val="24"/>
+          <w:rtl w:val="1"/>
+        </w:rPr>
+        <w:t xml:space="preserve"> </w:t>
+      </w:r>
+      <w:r>
+        <w:rPr>
+          <w:rFonts w:ascii="Jomhuria" w:cs="Jomhuria" w:eastAsia="Jomhuria" w:hAnsi="Jomhuria"/>
+          <w:sz w:val="24"/>
+          <w:szCs w:val="24"/>
+          <w:rtl w:val="1"/>
+        </w:rPr>
+        <w:t xml:space="preserve">فردي</w:t>
+      </w:r>
+      <w:r>
+        <w:rPr>
+          <w:rFonts w:ascii="Roboto Mono" w:cs="Roboto Mono" w:eastAsia="Roboto Mono" w:hAnsi="Roboto Mono"/>
+          <w:sz w:val="24"/>
+          <w:szCs w:val="24"/>
+          <w:rtl w:val="1"/>
+        </w:rPr>
+        <w:t xml:space="preserve"> </w:t>
+      </w:r>
+      <w:r>
+        <w:rPr>
+          <w:rFonts w:ascii="Jomhuria" w:cs="Jomhuria" w:eastAsia="Jomhuria" w:hAnsi="Jomhuria"/>
+          <w:sz w:val="24"/>
+          <w:szCs w:val="24"/>
+          <w:rtl w:val="1"/>
+        </w:rPr>
+        <w:t xml:space="preserve">على</w:t>
+      </w:r>
+      <w:r>
+        <w:rPr>
+          <w:rFonts w:ascii="Roboto Mono" w:cs="Roboto Mono" w:eastAsia="Roboto Mono" w:hAnsi="Roboto Mono"/>
+          <w:sz w:val="24"/>
+          <w:szCs w:val="24"/>
+          <w:rtl w:val="1"/>
+        </w:rPr>
+        <w:t xml:space="preserve"> </w:t>
+      </w:r>
+      <w:r>
+        <w:rPr>
+          <w:rFonts w:ascii="Jomhuria" w:cs="Jomhuria" w:eastAsia="Jomhuria" w:hAnsi="Jomhuria"/>
+          <w:sz w:val="24"/>
+          <w:szCs w:val="24"/>
+          <w:rtl w:val="1"/>
+        </w:rPr>
+        <w:t xml:space="preserve">الأجزاء</w:t>
+      </w:r>
+      <w:r>
+        <w:rPr>
+          <w:rFonts w:ascii="Roboto Mono" w:cs="Roboto Mono" w:eastAsia="Roboto Mono" w:hAnsi="Roboto Mono"/>
+          <w:sz w:val="24"/>
+          <w:szCs w:val="24"/>
+          <w:rtl w:val="1"/>
+        </w:rPr>
+        <w:t xml:space="preserve"> + </w:t>
+      </w:r>
+      <w:r>
+        <w:rPr>
+          <w:rFonts w:ascii="Jomhuria" w:cs="Jomhuria" w:eastAsia="Jomhuria" w:hAnsi="Jomhuria"/>
+          <w:sz w:val="24"/>
+          <w:szCs w:val="24"/>
+          <w:rtl w:val="1"/>
+        </w:rPr>
+        <w:t xml:space="preserve">تحديثات</w:t>
+      </w:r>
+      <w:r>
+        <w:rPr>
+          <w:rFonts w:ascii="Roboto Mono" w:cs="Roboto Mono" w:eastAsia="Roboto Mono" w:hAnsi="Roboto Mono"/>
+          <w:sz w:val="24"/>
+          <w:szCs w:val="24"/>
+          <w:rtl w:val="1"/>
+        </w:rPr>
+        <w:t xml:space="preserve"> </w:t>
+      </w:r>
+      <w:r>
+        <w:rPr>
+          <w:rFonts w:ascii="Jomhuria" w:cs="Jomhuria" w:eastAsia="Jomhuria" w:hAnsi="Jomhuria"/>
+          <w:sz w:val="24"/>
+          <w:szCs w:val="24"/>
+          <w:rtl w:val="1"/>
+        </w:rPr>
+        <w:t xml:space="preserve">يومية</w:t>
       </w:r>
     </w:p>
     <w:p>
@@ -13659,391 +12640,18 @@
           <w:rtl w:val="0"/>
         </w:rPr>
       </w:r>
-      <w:r>
-        <w:rPr>
-          <w:rFonts w:ascii="Arial Unicode MS" w:cs="Arial Unicode MS" w:eastAsia="Arial Unicode MS" w:hAnsi="Arial Unicode MS"/>
-          <w:sz w:val="24"/>
-          <w:szCs w:val="24"/>
-          <w:rtl w:val="1"/>
-        </w:rPr>
-        <w:t xml:space="preserve">├─ </w:t>
-      </w:r>
-      <w:r>
-        <w:rPr>
-          <w:rFonts w:ascii="Jomhuria" w:cs="Jomhuria" w:eastAsia="Jomhuria" w:hAnsi="Jomhuria"/>
-          <w:sz w:val="24"/>
-          <w:szCs w:val="24"/>
-          <w:rtl w:val="1"/>
-        </w:rPr>
-        <w:t xml:space="preserve">الساعة</w:t>
-      </w:r>
-      <w:r>
-        <w:rPr>
-          <w:rFonts w:ascii="Roboto Mono" w:cs="Roboto Mono" w:eastAsia="Roboto Mono" w:hAnsi="Roboto Mono"/>
-          <w:sz w:val="24"/>
-          <w:szCs w:val="24"/>
-          <w:rtl w:val="1"/>
-        </w:rPr>
-        <w:t xml:space="preserve"> 7-8: </w:t>
-      </w:r>
-      <w:r>
-        <w:rPr>
-          <w:rFonts w:ascii="Jomhuria" w:cs="Jomhuria" w:eastAsia="Jomhuria" w:hAnsi="Jomhuria"/>
-          <w:sz w:val="24"/>
-          <w:szCs w:val="24"/>
-          <w:rtl w:val="1"/>
-        </w:rPr>
-        <w:t xml:space="preserve">اجتماع</w:t>
-      </w:r>
-      <w:r>
-        <w:rPr>
-          <w:rFonts w:ascii="Roboto Mono" w:cs="Roboto Mono" w:eastAsia="Roboto Mono" w:hAnsi="Roboto Mono"/>
-          <w:sz w:val="24"/>
-          <w:szCs w:val="24"/>
-          <w:rtl w:val="1"/>
-        </w:rPr>
-        <w:t xml:space="preserve"> </w:t>
-      </w:r>
-      <w:r>
-        <w:rPr>
-          <w:rFonts w:ascii="Jomhuria" w:cs="Jomhuria" w:eastAsia="Jomhuria" w:hAnsi="Jomhuria"/>
-          <w:sz w:val="24"/>
-          <w:szCs w:val="24"/>
-          <w:rtl w:val="1"/>
-        </w:rPr>
-        <w:t xml:space="preserve">توزيع</w:t>
-      </w:r>
-      <w:r>
-        <w:rPr>
-          <w:rFonts w:ascii="Roboto Mono" w:cs="Roboto Mono" w:eastAsia="Roboto Mono" w:hAnsi="Roboto Mono"/>
-          <w:sz w:val="24"/>
-          <w:szCs w:val="24"/>
-          <w:rtl w:val="1"/>
-        </w:rPr>
-        <w:t xml:space="preserve"> </w:t>
-      </w:r>
-      <w:r>
-        <w:rPr>
-          <w:rFonts w:ascii="Jomhuria" w:cs="Jomhuria" w:eastAsia="Jomhuria" w:hAnsi="Jomhuria"/>
-          <w:sz w:val="24"/>
-          <w:szCs w:val="24"/>
-          <w:rtl w:val="1"/>
-        </w:rPr>
-        <w:t xml:space="preserve">المهام</w:t>
-      </w:r>
-    </w:p>
-    <w:p>
-      <w:pPr>
-        <w:bidi w:val="1"/>
-        <w:rPr>
-          <w:rFonts w:ascii="Roboto Mono" w:cs="Roboto Mono" w:eastAsia="Roboto Mono" w:hAnsi="Roboto Mono"/>
-          <w:sz w:val="24"/>
-          <w:szCs w:val="24"/>
-        </w:rPr>
-      </w:pPr>
-      <w:r>
-        <w:rPr>
-          <w:rtl w:val="0"/>
-        </w:rPr>
-      </w:r>
-      <w:r>
-        <w:rPr>
-          <w:rFonts w:ascii="Arial Unicode MS" w:cs="Arial Unicode MS" w:eastAsia="Arial Unicode MS" w:hAnsi="Arial Unicode MS"/>
-          <w:sz w:val="24"/>
-          <w:szCs w:val="24"/>
-          <w:rtl w:val="1"/>
-        </w:rPr>
-        <w:t xml:space="preserve">└─ </w:t>
-      </w:r>
-      <w:r>
-        <w:rPr>
-          <w:rFonts w:ascii="Jomhuria" w:cs="Jomhuria" w:eastAsia="Jomhuria" w:hAnsi="Jomhuria"/>
-          <w:sz w:val="24"/>
-          <w:szCs w:val="24"/>
-          <w:rtl w:val="1"/>
-        </w:rPr>
-        <w:t xml:space="preserve">الساعة</w:t>
-      </w:r>
-      <w:r>
-        <w:rPr>
-          <w:rFonts w:ascii="Roboto Mono" w:cs="Roboto Mono" w:eastAsia="Roboto Mono" w:hAnsi="Roboto Mono"/>
-          <w:sz w:val="24"/>
-          <w:szCs w:val="24"/>
-          <w:rtl w:val="1"/>
-        </w:rPr>
-        <w:t xml:space="preserve"> 8-10: </w:t>
-      </w:r>
-      <w:r>
-        <w:rPr>
-          <w:rFonts w:ascii="Jomhuria" w:cs="Jomhuria" w:eastAsia="Jomhuria" w:hAnsi="Jomhuria"/>
-          <w:sz w:val="24"/>
-          <w:szCs w:val="24"/>
-          <w:rtl w:val="1"/>
-        </w:rPr>
-        <w:t xml:space="preserve">كل</w:t>
-      </w:r>
-      <w:r>
-        <w:rPr>
-          <w:rFonts w:ascii="Roboto Mono" w:cs="Roboto Mono" w:eastAsia="Roboto Mono" w:hAnsi="Roboto Mono"/>
-          <w:sz w:val="24"/>
-          <w:szCs w:val="24"/>
-          <w:rtl w:val="1"/>
-        </w:rPr>
-        <w:t xml:space="preserve"> </w:t>
-      </w:r>
-      <w:r>
-        <w:rPr>
-          <w:rFonts w:ascii="Jomhuria" w:cs="Jomhuria" w:eastAsia="Jomhuria" w:hAnsi="Jomhuria"/>
-          <w:sz w:val="24"/>
-          <w:szCs w:val="24"/>
-          <w:rtl w:val="1"/>
-        </w:rPr>
-        <w:t xml:space="preserve">عضو</w:t>
-      </w:r>
-      <w:r>
-        <w:rPr>
-          <w:rFonts w:ascii="Roboto Mono" w:cs="Roboto Mono" w:eastAsia="Roboto Mono" w:hAnsi="Roboto Mono"/>
-          <w:sz w:val="24"/>
-          <w:szCs w:val="24"/>
-          <w:rtl w:val="1"/>
-        </w:rPr>
-        <w:t xml:space="preserve"> </w:t>
-      </w:r>
-      <w:r>
-        <w:rPr>
-          <w:rFonts w:ascii="Jomhuria" w:cs="Jomhuria" w:eastAsia="Jomhuria" w:hAnsi="Jomhuria"/>
-          <w:sz w:val="24"/>
-          <w:szCs w:val="24"/>
-          <w:rtl w:val="1"/>
-        </w:rPr>
-        <w:t xml:space="preserve">يبدأ</w:t>
-      </w:r>
-      <w:r>
-        <w:rPr>
-          <w:rFonts w:ascii="Roboto Mono" w:cs="Roboto Mono" w:eastAsia="Roboto Mono" w:hAnsi="Roboto Mono"/>
-          <w:sz w:val="24"/>
-          <w:szCs w:val="24"/>
-          <w:rtl w:val="1"/>
-        </w:rPr>
-        <w:t xml:space="preserve"> </w:t>
-      </w:r>
-      <w:r>
-        <w:rPr>
-          <w:rFonts w:ascii="Jomhuria" w:cs="Jomhuria" w:eastAsia="Jomhuria" w:hAnsi="Jomhuria"/>
-          <w:sz w:val="24"/>
-          <w:szCs w:val="24"/>
-          <w:rtl w:val="1"/>
-        </w:rPr>
-        <w:t xml:space="preserve">جزءه</w:t>
-      </w:r>
-    </w:p>
-    <w:p>
-      <w:pPr>
-        <w:bidi w:val="1"/>
-        <w:rPr>
-          <w:rFonts w:ascii="Roboto Mono" w:cs="Roboto Mono" w:eastAsia="Roboto Mono" w:hAnsi="Roboto Mono"/>
-          <w:sz w:val="24"/>
-          <w:szCs w:val="24"/>
-        </w:rPr>
-      </w:pPr>
-      <w:r>
-        <w:rPr>
-          <w:rtl w:val="0"/>
-        </w:rPr>
-      </w:r>
-    </w:p>
-    <w:p>
-      <w:pPr>
-        <w:bidi w:val="1"/>
-        <w:rPr>
-          <w:rFonts w:ascii="Roboto Mono" w:cs="Roboto Mono" w:eastAsia="Roboto Mono" w:hAnsi="Roboto Mono"/>
-          <w:sz w:val="24"/>
-          <w:szCs w:val="24"/>
-        </w:rPr>
-      </w:pPr>
-      <w:r>
-        <w:rPr>
-          <w:rFonts w:ascii="Jomhuria" w:cs="Jomhuria" w:eastAsia="Jomhuria" w:hAnsi="Jomhuria"/>
-          <w:sz w:val="24"/>
-          <w:szCs w:val="24"/>
-          <w:rtl w:val="1"/>
-        </w:rPr>
-        <w:t xml:space="preserve">اليوم</w:t>
-      </w:r>
-      <w:r>
-        <w:rPr>
-          <w:rFonts w:ascii="Roboto Mono" w:cs="Roboto Mono" w:eastAsia="Roboto Mono" w:hAnsi="Roboto Mono"/>
-          <w:sz w:val="24"/>
-          <w:szCs w:val="24"/>
-          <w:rtl w:val="1"/>
-        </w:rPr>
-        <w:t xml:space="preserve"> 2-3:</w:t>
-      </w:r>
-    </w:p>
-    <w:p>
-      <w:pPr>
-        <w:bidi w:val="1"/>
-        <w:rPr>
-          <w:rFonts w:ascii="Roboto Mono" w:cs="Roboto Mono" w:eastAsia="Roboto Mono" w:hAnsi="Roboto Mono"/>
-          <w:sz w:val="24"/>
-          <w:szCs w:val="24"/>
-        </w:rPr>
-      </w:pPr>
-      <w:r>
-        <w:rPr>
-          <w:rtl w:val="0"/>
-        </w:rPr>
-      </w:r>
-      <w:r>
-        <w:rPr>
-          <w:rFonts w:ascii="Arial Unicode MS" w:cs="Arial Unicode MS" w:eastAsia="Arial Unicode MS" w:hAnsi="Arial Unicode MS"/>
-          <w:sz w:val="24"/>
-          <w:szCs w:val="24"/>
-          <w:rtl w:val="1"/>
-        </w:rPr>
-        <w:t xml:space="preserve">└─ </w:t>
-      </w:r>
-      <w:r>
-        <w:rPr>
-          <w:rFonts w:ascii="Jomhuria" w:cs="Jomhuria" w:eastAsia="Jomhuria" w:hAnsi="Jomhuria"/>
-          <w:sz w:val="24"/>
-          <w:szCs w:val="24"/>
-          <w:rtl w:val="1"/>
-        </w:rPr>
-        <w:t xml:space="preserve">عمل</w:t>
-      </w:r>
-      <w:r>
-        <w:rPr>
-          <w:rFonts w:ascii="Roboto Mono" w:cs="Roboto Mono" w:eastAsia="Roboto Mono" w:hAnsi="Roboto Mono"/>
-          <w:sz w:val="24"/>
-          <w:szCs w:val="24"/>
-          <w:rtl w:val="1"/>
-        </w:rPr>
-        <w:t xml:space="preserve"> </w:t>
-      </w:r>
-      <w:r>
-        <w:rPr>
-          <w:rFonts w:ascii="Jomhuria" w:cs="Jomhuria" w:eastAsia="Jomhuria" w:hAnsi="Jomhuria"/>
-          <w:sz w:val="24"/>
-          <w:szCs w:val="24"/>
-          <w:rtl w:val="1"/>
-        </w:rPr>
-        <w:t xml:space="preserve">فردي</w:t>
-      </w:r>
-      <w:r>
-        <w:rPr>
-          <w:rFonts w:ascii="Roboto Mono" w:cs="Roboto Mono" w:eastAsia="Roboto Mono" w:hAnsi="Roboto Mono"/>
-          <w:sz w:val="24"/>
-          <w:szCs w:val="24"/>
-          <w:rtl w:val="1"/>
-        </w:rPr>
-        <w:t xml:space="preserve"> </w:t>
-      </w:r>
-      <w:r>
-        <w:rPr>
-          <w:rFonts w:ascii="Jomhuria" w:cs="Jomhuria" w:eastAsia="Jomhuria" w:hAnsi="Jomhuria"/>
-          <w:sz w:val="24"/>
-          <w:szCs w:val="24"/>
-          <w:rtl w:val="1"/>
-        </w:rPr>
-        <w:t xml:space="preserve">على</w:t>
-      </w:r>
-      <w:r>
-        <w:rPr>
-          <w:rFonts w:ascii="Roboto Mono" w:cs="Roboto Mono" w:eastAsia="Roboto Mono" w:hAnsi="Roboto Mono"/>
-          <w:sz w:val="24"/>
-          <w:szCs w:val="24"/>
-          <w:rtl w:val="1"/>
-        </w:rPr>
-        <w:t xml:space="preserve"> </w:t>
-      </w:r>
-      <w:r>
-        <w:rPr>
-          <w:rFonts w:ascii="Jomhuria" w:cs="Jomhuria" w:eastAsia="Jomhuria" w:hAnsi="Jomhuria"/>
-          <w:sz w:val="24"/>
-          <w:szCs w:val="24"/>
-          <w:rtl w:val="1"/>
-        </w:rPr>
-        <w:t xml:space="preserve">الأجزاء</w:t>
-      </w:r>
-      <w:r>
-        <w:rPr>
-          <w:rFonts w:ascii="Roboto Mono" w:cs="Roboto Mono" w:eastAsia="Roboto Mono" w:hAnsi="Roboto Mono"/>
-          <w:sz w:val="24"/>
-          <w:szCs w:val="24"/>
-          <w:rtl w:val="1"/>
-        </w:rPr>
-        <w:t xml:space="preserve"> + </w:t>
-      </w:r>
-      <w:r>
-        <w:rPr>
-          <w:rFonts w:ascii="Jomhuria" w:cs="Jomhuria" w:eastAsia="Jomhuria" w:hAnsi="Jomhuria"/>
-          <w:sz w:val="24"/>
-          <w:szCs w:val="24"/>
-          <w:rtl w:val="1"/>
-        </w:rPr>
-        <w:t xml:space="preserve">تحديثات</w:t>
-      </w:r>
-      <w:r>
-        <w:rPr>
-          <w:rFonts w:ascii="Roboto Mono" w:cs="Roboto Mono" w:eastAsia="Roboto Mono" w:hAnsi="Roboto Mono"/>
-          <w:sz w:val="24"/>
-          <w:szCs w:val="24"/>
-          <w:rtl w:val="1"/>
-        </w:rPr>
-        <w:t xml:space="preserve"> </w:t>
-      </w:r>
-      <w:r>
-        <w:rPr>
-          <w:rFonts w:ascii="Jomhuria" w:cs="Jomhuria" w:eastAsia="Jomhuria" w:hAnsi="Jomhuria"/>
-          <w:sz w:val="24"/>
-          <w:szCs w:val="24"/>
-          <w:rtl w:val="1"/>
-        </w:rPr>
-        <w:t xml:space="preserve">يومية</w:t>
-      </w:r>
-    </w:p>
-    <w:p>
-      <w:pPr>
-        <w:bidi w:val="1"/>
-        <w:rPr>
-          <w:rFonts w:ascii="Roboto Mono" w:cs="Roboto Mono" w:eastAsia="Roboto Mono" w:hAnsi="Roboto Mono"/>
-          <w:sz w:val="24"/>
-          <w:szCs w:val="24"/>
-        </w:rPr>
-      </w:pPr>
-      <w:r>
-        <w:rPr>
-          <w:rtl w:val="0"/>
-        </w:rPr>
-      </w:r>
-    </w:p>
-    <w:p>
-      <w:pPr>
-        <w:bidi w:val="1"/>
-        <w:rPr>
-          <w:rFonts w:ascii="Roboto Mono" w:cs="Roboto Mono" w:eastAsia="Roboto Mono" w:hAnsi="Roboto Mono"/>
-          <w:sz w:val="24"/>
-          <w:szCs w:val="24"/>
-        </w:rPr>
-      </w:pPr>
-      <w:r>
-        <w:rPr>
-          <w:rFonts w:ascii="Jomhuria" w:cs="Jomhuria" w:eastAsia="Jomhuria" w:hAnsi="Jomhuria"/>
-          <w:sz w:val="24"/>
-          <w:szCs w:val="24"/>
-          <w:rtl w:val="1"/>
-        </w:rPr>
-        <w:t xml:space="preserve">اليوم</w:t>
-      </w:r>
-      <w:r>
-        <w:rPr>
-          <w:rFonts w:ascii="Roboto Mono" w:cs="Roboto Mono" w:eastAsia="Roboto Mono" w:hAnsi="Roboto Mono"/>
-          <w:sz w:val="24"/>
-          <w:szCs w:val="24"/>
-          <w:rtl w:val="1"/>
-        </w:rPr>
-        <w:t xml:space="preserve"> 4:</w:t>
+    </w:p>
+    <w:p>
+      <w:pPr>
+        <w:bidi w:val="1"/>
+        <w:rPr>
+          <w:rFonts w:ascii="Roboto Mono" w:cs="Roboto Mono" w:eastAsia="Roboto Mono" w:hAnsi="Roboto Mono"/>
+          <w:sz w:val="24"/>
+          <w:szCs w:val="24"/>
+        </w:rPr>
+      </w:pPr>
+      <w:r>
+        <w:t>اليوم 3:</w:t>
       </w:r>
     </w:p>
     <w:p>
@@ -14963,185 +13571,20 @@
         </w:rPr>
       </w:pPr>
       <w:r>
-        <w:rPr>
-          <w:rFonts w:ascii="Jomhuria" w:cs="Jomhuria" w:eastAsia="Jomhuria" w:hAnsi="Jomhuria"/>
-          <w:sz w:val="24"/>
-          <w:szCs w:val="24"/>
-          <w:rtl w:val="1"/>
-        </w:rPr>
-        <w:t xml:space="preserve">موعد</w:t>
-      </w:r>
-      <w:r>
-        <w:rPr>
-          <w:rFonts w:ascii="Roboto Mono" w:cs="Roboto Mono" w:eastAsia="Roboto Mono" w:hAnsi="Roboto Mono"/>
-          <w:sz w:val="24"/>
-          <w:szCs w:val="24"/>
-          <w:rtl w:val="1"/>
-        </w:rPr>
-        <w:t xml:space="preserve"> </w:t>
-      </w:r>
-      <w:r>
-        <w:rPr>
-          <w:rFonts w:ascii="Jomhuria" w:cs="Jomhuria" w:eastAsia="Jomhuria" w:hAnsi="Jomhuria"/>
-          <w:sz w:val="24"/>
-          <w:szCs w:val="24"/>
-          <w:rtl w:val="1"/>
-        </w:rPr>
-        <w:t xml:space="preserve">التسليم</w:t>
-      </w:r>
-      <w:r>
-        <w:rPr>
-          <w:rFonts w:ascii="Roboto Mono" w:cs="Roboto Mono" w:eastAsia="Roboto Mono" w:hAnsi="Roboto Mono"/>
-          <w:sz w:val="24"/>
-          <w:szCs w:val="24"/>
-          <w:rtl w:val="1"/>
-        </w:rPr>
-        <w:t xml:space="preserve"> </w:t>
-      </w:r>
-      <w:r>
-        <w:rPr>
-          <w:rFonts w:ascii="Jomhuria" w:cs="Jomhuria" w:eastAsia="Jomhuria" w:hAnsi="Jomhuria"/>
-          <w:sz w:val="24"/>
-          <w:szCs w:val="24"/>
-          <w:rtl w:val="1"/>
-        </w:rPr>
-        <w:t xml:space="preserve">الداخلي</w:t>
-      </w:r>
-      <w:r>
-        <w:rPr>
-          <w:rFonts w:ascii="Roboto Mono" w:cs="Roboto Mono" w:eastAsia="Roboto Mono" w:hAnsi="Roboto Mono"/>
-          <w:sz w:val="24"/>
-          <w:szCs w:val="24"/>
-          <w:rtl w:val="1"/>
-        </w:rPr>
-        <w:t xml:space="preserve">: </w:t>
-      </w:r>
-      <w:r>
-        <w:rPr>
-          <w:rFonts w:ascii="Jomhuria" w:cs="Jomhuria" w:eastAsia="Jomhuria" w:hAnsi="Jomhuria"/>
-          <w:sz w:val="24"/>
-          <w:szCs w:val="24"/>
-          <w:rtl w:val="1"/>
-        </w:rPr>
-        <w:t xml:space="preserve">يوم</w:t>
-      </w:r>
-      <w:r>
-        <w:rPr>
-          <w:rFonts w:ascii="Jomhuria" w:cs="Jomhuria" w:eastAsia="Jomhuria" w:hAnsi="Jomhuria"/>
-          <w:sz w:val="24"/>
-          <w:szCs w:val="24"/>
-          <w:rtl w:val="1"/>
-        </w:rPr>
-        <w:t xml:space="preserve"> 4، </w:t>
-      </w:r>
-      <w:r>
-        <w:rPr>
-          <w:rFonts w:ascii="Jomhuria" w:cs="Jomhuria" w:eastAsia="Jomhuria" w:hAnsi="Jomhuria"/>
-          <w:sz w:val="24"/>
-          <w:szCs w:val="24"/>
-          <w:rtl w:val="1"/>
-        </w:rPr>
-        <w:t xml:space="preserve">الساعة</w:t>
-      </w:r>
-      <w:r>
-        <w:rPr>
-          <w:rFonts w:ascii="Roboto Mono" w:cs="Roboto Mono" w:eastAsia="Roboto Mono" w:hAnsi="Roboto Mono"/>
-          <w:sz w:val="24"/>
-          <w:szCs w:val="24"/>
-          <w:rtl w:val="1"/>
-        </w:rPr>
-        <w:t xml:space="preserve"> 6 </w:t>
-      </w:r>
-      <w:r>
-        <w:rPr>
-          <w:rFonts w:ascii="Jomhuria" w:cs="Jomhuria" w:eastAsia="Jomhuria" w:hAnsi="Jomhuria"/>
-          <w:sz w:val="24"/>
-          <w:szCs w:val="24"/>
-          <w:rtl w:val="1"/>
-        </w:rPr>
-        <w:t xml:space="preserve">مساء</w:t>
-      </w:r>
-      <w:r>
-        <w:rPr>
-          <w:rFonts w:ascii="Jomhuria" w:cs="Jomhuria" w:eastAsia="Jomhuria" w:hAnsi="Jomhuria"/>
-          <w:sz w:val="24"/>
-          <w:szCs w:val="24"/>
-          <w:rtl w:val="1"/>
-        </w:rPr>
-        <w:t xml:space="preserve">ً</w:t>
-      </w:r>
-    </w:p>
-    <w:p>
-      <w:pPr>
-        <w:bidi w:val="1"/>
-        <w:rPr>
-          <w:rFonts w:ascii="Roboto Mono" w:cs="Roboto Mono" w:eastAsia="Roboto Mono" w:hAnsi="Roboto Mono"/>
-          <w:sz w:val="24"/>
-          <w:szCs w:val="24"/>
-        </w:rPr>
-      </w:pPr>
-      <w:r>
-        <w:rPr>
-          <w:rFonts w:ascii="Jomhuria" w:cs="Jomhuria" w:eastAsia="Jomhuria" w:hAnsi="Jomhuria"/>
-          <w:sz w:val="24"/>
-          <w:szCs w:val="24"/>
-          <w:rtl w:val="1"/>
-        </w:rPr>
-        <w:t xml:space="preserve">الموعد</w:t>
-      </w:r>
-      <w:r>
-        <w:rPr>
-          <w:rFonts w:ascii="Roboto Mono" w:cs="Roboto Mono" w:eastAsia="Roboto Mono" w:hAnsi="Roboto Mono"/>
-          <w:sz w:val="24"/>
-          <w:szCs w:val="24"/>
-          <w:rtl w:val="1"/>
-        </w:rPr>
-        <w:t xml:space="preserve"> </w:t>
-      </w:r>
-      <w:r>
-        <w:rPr>
-          <w:rFonts w:ascii="Jomhuria" w:cs="Jomhuria" w:eastAsia="Jomhuria" w:hAnsi="Jomhuria"/>
-          <w:sz w:val="24"/>
-          <w:szCs w:val="24"/>
-          <w:rtl w:val="1"/>
-        </w:rPr>
-        <w:t xml:space="preserve">الرسمي</w:t>
-      </w:r>
-      <w:r>
-        <w:rPr>
-          <w:rFonts w:ascii="Roboto Mono" w:cs="Roboto Mono" w:eastAsia="Roboto Mono" w:hAnsi="Roboto Mono"/>
-          <w:sz w:val="24"/>
-          <w:szCs w:val="24"/>
-          <w:rtl w:val="1"/>
-        </w:rPr>
-        <w:t xml:space="preserve">: </w:t>
-      </w:r>
-      <w:r>
-        <w:rPr>
-          <w:rFonts w:ascii="Jomhuria" w:cs="Jomhuria" w:eastAsia="Jomhuria" w:hAnsi="Jomhuria"/>
-          <w:sz w:val="24"/>
-          <w:szCs w:val="24"/>
-          <w:rtl w:val="1"/>
-        </w:rPr>
-        <w:t xml:space="preserve">يوم</w:t>
-      </w:r>
-      <w:r>
-        <w:rPr>
-          <w:rFonts w:ascii="Jomhuria" w:cs="Jomhuria" w:eastAsia="Jomhuria" w:hAnsi="Jomhuria"/>
-          <w:sz w:val="24"/>
-          <w:szCs w:val="24"/>
-          <w:rtl w:val="1"/>
-        </w:rPr>
-        <w:t xml:space="preserve"> 4، 11:59 </w:t>
-      </w:r>
-      <w:r>
-        <w:rPr>
-          <w:rFonts w:ascii="Jomhuria" w:cs="Jomhuria" w:eastAsia="Jomhuria" w:hAnsi="Jomhuria"/>
-          <w:sz w:val="24"/>
-          <w:szCs w:val="24"/>
-          <w:rtl w:val="1"/>
-        </w:rPr>
-        <w:t xml:space="preserve">م</w:t>
+        <w:t>موعد التسليم الداخلي: يوم 3، الساعة 6 مساءً</w:t>
+      </w:r>
+    </w:p>
+    <w:p>
+      <w:pPr>
+        <w:bidi w:val="1"/>
+        <w:rPr>
+          <w:rFonts w:ascii="Roboto Mono" w:cs="Roboto Mono" w:eastAsia="Roboto Mono" w:hAnsi="Roboto Mono"/>
+          <w:sz w:val="24"/>
+          <w:szCs w:val="24"/>
+        </w:rPr>
+      </w:pPr>
+      <w:r>
+        <w:t>الموعد الرسمي: يوم 3، 11:59 م</w:t>
       </w:r>
     </w:p>
     <w:p>
@@ -16287,72 +14730,7 @@
         </w:rPr>
       </w:pPr>
       <w:r>
-        <w:rPr>
-          <w:rtl w:val="0"/>
-        </w:rPr>
-      </w:r>
-      <w:r>
-        <w:rPr>
-          <w:rFonts w:ascii="Arial Unicode MS" w:cs="Arial Unicode MS" w:eastAsia="Arial Unicode MS" w:hAnsi="Arial Unicode MS"/>
-          <w:sz w:val="24"/>
-          <w:szCs w:val="24"/>
-          <w:rtl w:val="1"/>
-        </w:rPr>
-        <w:t xml:space="preserve">✅ </w:t>
-      </w:r>
-      <w:r>
-        <w:rPr>
-          <w:rFonts w:ascii="Jomhuria" w:cs="Jomhuria" w:eastAsia="Jomhuria" w:hAnsi="Jomhuria"/>
-          <w:sz w:val="24"/>
-          <w:szCs w:val="24"/>
-          <w:rtl w:val="1"/>
-        </w:rPr>
-        <w:t xml:space="preserve">اليوم</w:t>
-      </w:r>
-      <w:r>
-        <w:rPr>
-          <w:rFonts w:ascii="Jomhuria" w:cs="Jomhuria" w:eastAsia="Jomhuria" w:hAnsi="Jomhuria"/>
-          <w:sz w:val="24"/>
-          <w:szCs w:val="24"/>
-          <w:rtl w:val="1"/>
-        </w:rPr>
-        <w:t xml:space="preserve"> 9، </w:t>
-      </w:r>
-      <w:r>
-        <w:rPr>
-          <w:rFonts w:ascii="Jomhuria" w:cs="Jomhuria" w:eastAsia="Jomhuria" w:hAnsi="Jomhuria"/>
-          <w:sz w:val="24"/>
-          <w:szCs w:val="24"/>
-          <w:rtl w:val="1"/>
-        </w:rPr>
-        <w:t xml:space="preserve">الساعة</w:t>
-      </w:r>
-      <w:r>
-        <w:rPr>
-          <w:rFonts w:ascii="Roboto" w:cs="Roboto" w:eastAsia="Roboto" w:hAnsi="Roboto"/>
-          <w:sz w:val="24"/>
-          <w:szCs w:val="24"/>
-          <w:rtl w:val="1"/>
-        </w:rPr>
-        <w:t xml:space="preserve"> 11:59 </w:t>
-      </w:r>
-      <w:r>
-        <w:rPr>
-          <w:rFonts w:ascii="Jomhuria" w:cs="Jomhuria" w:eastAsia="Jomhuria" w:hAnsi="Jomhuria"/>
-          <w:sz w:val="24"/>
-          <w:szCs w:val="24"/>
-          <w:rtl w:val="1"/>
-        </w:rPr>
-        <w:t xml:space="preserve">مساء</w:t>
-      </w:r>
-      <w:r>
-        <w:rPr>
-          <w:rFonts w:ascii="Jomhuria" w:cs="Jomhuria" w:eastAsia="Jomhuria" w:hAnsi="Jomhuria"/>
-          <w:sz w:val="24"/>
-          <w:szCs w:val="24"/>
-          <w:rtl w:val="1"/>
-        </w:rPr>
-        <w:t xml:space="preserve">ً</w:t>
+        <w:t>✅ اليوم 8، الساعة 11:59 مساءً</w:t>
       </w:r>
     </w:p>
     <w:p>
@@ -17091,22 +15469,7 @@
         </w:rPr>
       </w:pPr>
       <w:r>
-        <w:rPr>
-          <w:rFonts w:ascii="Jomhuria" w:cs="Jomhuria" w:eastAsia="Jomhuria" w:hAnsi="Jomhuria"/>
-          <w:sz w:val="24"/>
-          <w:szCs w:val="24"/>
-          <w:rtl w:val="1"/>
-        </w:rPr>
-        <w:t xml:space="preserve">اليوم</w:t>
-      </w:r>
-      <w:r>
-        <w:rPr>
-          <w:rFonts w:ascii="Roboto Mono" w:cs="Roboto Mono" w:eastAsia="Roboto Mono" w:hAnsi="Roboto Mono"/>
-          <w:sz w:val="24"/>
-          <w:szCs w:val="24"/>
-          <w:rtl w:val="1"/>
-        </w:rPr>
-        <w:t xml:space="preserve"> 9:</w:t>
+        <w:t>اليوم 8:</w:t>
       </w:r>
     </w:p>
     <w:p>
@@ -19131,72 +17494,7 @@
         </w:rPr>
       </w:pPr>
       <w:r>
-        <w:rPr>
-          <w:rtl w:val="0"/>
-        </w:rPr>
-      </w:r>
-      <w:r>
-        <w:rPr>
-          <w:rFonts w:ascii="Arial Unicode MS" w:cs="Arial Unicode MS" w:eastAsia="Arial Unicode MS" w:hAnsi="Arial Unicode MS"/>
-          <w:sz w:val="24"/>
-          <w:szCs w:val="24"/>
-          <w:rtl w:val="1"/>
-        </w:rPr>
-        <w:t xml:space="preserve">✅ </w:t>
-      </w:r>
-      <w:r>
-        <w:rPr>
-          <w:rFonts w:ascii="Jomhuria" w:cs="Jomhuria" w:eastAsia="Jomhuria" w:hAnsi="Jomhuria"/>
-          <w:sz w:val="24"/>
-          <w:szCs w:val="24"/>
-          <w:rtl w:val="1"/>
-        </w:rPr>
-        <w:t xml:space="preserve">اليوم</w:t>
-      </w:r>
-      <w:r>
-        <w:rPr>
-          <w:rFonts w:ascii="Jomhuria" w:cs="Jomhuria" w:eastAsia="Jomhuria" w:hAnsi="Jomhuria"/>
-          <w:sz w:val="24"/>
-          <w:szCs w:val="24"/>
-          <w:rtl w:val="1"/>
-        </w:rPr>
-        <w:t xml:space="preserve"> 15، </w:t>
-      </w:r>
-      <w:r>
-        <w:rPr>
-          <w:rFonts w:ascii="Jomhuria" w:cs="Jomhuria" w:eastAsia="Jomhuria" w:hAnsi="Jomhuria"/>
-          <w:sz w:val="24"/>
-          <w:szCs w:val="24"/>
-          <w:rtl w:val="1"/>
-        </w:rPr>
-        <w:t xml:space="preserve">الساعة</w:t>
-      </w:r>
-      <w:r>
-        <w:rPr>
-          <w:rFonts w:ascii="Roboto" w:cs="Roboto" w:eastAsia="Roboto" w:hAnsi="Roboto"/>
-          <w:sz w:val="24"/>
-          <w:szCs w:val="24"/>
-          <w:rtl w:val="1"/>
-        </w:rPr>
-        <w:t xml:space="preserve"> 11:59 </w:t>
-      </w:r>
-      <w:r>
-        <w:rPr>
-          <w:rFonts w:ascii="Jomhuria" w:cs="Jomhuria" w:eastAsia="Jomhuria" w:hAnsi="Jomhuria"/>
-          <w:sz w:val="24"/>
-          <w:szCs w:val="24"/>
-          <w:rtl w:val="1"/>
-        </w:rPr>
-        <w:t xml:space="preserve">مساء</w:t>
-      </w:r>
-      <w:r>
-        <w:rPr>
-          <w:rFonts w:ascii="Jomhuria" w:cs="Jomhuria" w:eastAsia="Jomhuria" w:hAnsi="Jomhuria"/>
-          <w:sz w:val="24"/>
-          <w:szCs w:val="24"/>
-          <w:rtl w:val="1"/>
-        </w:rPr>
-        <w:t xml:space="preserve">ً</w:t>
+        <w:t>✅ اليوم 14، الساعة 11:59 مساءً</w:t>
       </w:r>
     </w:p>
     <w:p>
@@ -20635,22 +18933,7 @@
         </w:rPr>
       </w:pPr>
       <w:r>
-        <w:rPr>
-          <w:rFonts w:ascii="Jomhuria" w:cs="Jomhuria" w:eastAsia="Jomhuria" w:hAnsi="Jomhuria"/>
-          <w:sz w:val="24"/>
-          <w:szCs w:val="24"/>
-          <w:rtl w:val="1"/>
-        </w:rPr>
-        <w:t xml:space="preserve">اليوم</w:t>
-      </w:r>
-      <w:r>
-        <w:rPr>
-          <w:rFonts w:ascii="Roboto Mono" w:cs="Roboto Mono" w:eastAsia="Roboto Mono" w:hAnsi="Roboto Mono"/>
-          <w:sz w:val="24"/>
-          <w:szCs w:val="24"/>
-          <w:rtl w:val="1"/>
-        </w:rPr>
-        <w:t xml:space="preserve"> 15:</w:t>
+        <w:t>اليوم 14:</w:t>
       </w:r>
     </w:p>
     <w:p>
@@ -22826,72 +21109,7 @@
         </w:rPr>
       </w:pPr>
       <w:r>
-        <w:rPr>
-          <w:rtl w:val="0"/>
-        </w:rPr>
-      </w:r>
-      <w:r>
-        <w:rPr>
-          <w:rFonts w:ascii="Arial Unicode MS" w:cs="Arial Unicode MS" w:eastAsia="Arial Unicode MS" w:hAnsi="Arial Unicode MS"/>
-          <w:sz w:val="24"/>
-          <w:szCs w:val="24"/>
-          <w:rtl w:val="1"/>
-        </w:rPr>
-        <w:t xml:space="preserve">✅ </w:t>
-      </w:r>
-      <w:r>
-        <w:rPr>
-          <w:rFonts w:ascii="Jomhuria" w:cs="Jomhuria" w:eastAsia="Jomhuria" w:hAnsi="Jomhuria"/>
-          <w:sz w:val="24"/>
-          <w:szCs w:val="24"/>
-          <w:rtl w:val="1"/>
-        </w:rPr>
-        <w:t xml:space="preserve">اليوم</w:t>
-      </w:r>
-      <w:r>
-        <w:rPr>
-          <w:rFonts w:ascii="Jomhuria" w:cs="Jomhuria" w:eastAsia="Jomhuria" w:hAnsi="Jomhuria"/>
-          <w:sz w:val="24"/>
-          <w:szCs w:val="24"/>
-          <w:rtl w:val="1"/>
-        </w:rPr>
-        <w:t xml:space="preserve"> 18، </w:t>
-      </w:r>
-      <w:r>
-        <w:rPr>
-          <w:rFonts w:ascii="Jomhuria" w:cs="Jomhuria" w:eastAsia="Jomhuria" w:hAnsi="Jomhuria"/>
-          <w:sz w:val="24"/>
-          <w:szCs w:val="24"/>
-          <w:rtl w:val="1"/>
-        </w:rPr>
-        <w:t xml:space="preserve">الساعة</w:t>
-      </w:r>
-      <w:r>
-        <w:rPr>
-          <w:rFonts w:ascii="Roboto" w:cs="Roboto" w:eastAsia="Roboto" w:hAnsi="Roboto"/>
-          <w:sz w:val="24"/>
-          <w:szCs w:val="24"/>
-          <w:rtl w:val="1"/>
-        </w:rPr>
-        <w:t xml:space="preserve"> 11:59 </w:t>
-      </w:r>
-      <w:r>
-        <w:rPr>
-          <w:rFonts w:ascii="Jomhuria" w:cs="Jomhuria" w:eastAsia="Jomhuria" w:hAnsi="Jomhuria"/>
-          <w:sz w:val="24"/>
-          <w:szCs w:val="24"/>
-          <w:rtl w:val="1"/>
-        </w:rPr>
-        <w:t xml:space="preserve">مساء</w:t>
-      </w:r>
-      <w:r>
-        <w:rPr>
-          <w:rFonts w:ascii="Jomhuria" w:cs="Jomhuria" w:eastAsia="Jomhuria" w:hAnsi="Jomhuria"/>
-          <w:sz w:val="24"/>
-          <w:szCs w:val="24"/>
-          <w:rtl w:val="1"/>
-        </w:rPr>
-        <w:t xml:space="preserve">ً</w:t>
+        <w:t>✅ اليوم 17، الساعة 11:59 مساءً</w:t>
       </w:r>
     </w:p>
     <w:p>
@@ -23173,22 +21391,7 @@
         </w:rPr>
       </w:pPr>
       <w:r>
-        <w:rPr>
-          <w:rFonts w:ascii="Jomhuria" w:cs="Jomhuria" w:eastAsia="Jomhuria" w:hAnsi="Jomhuria"/>
-          <w:sz w:val="24"/>
-          <w:szCs w:val="24"/>
-          <w:rtl w:val="1"/>
-        </w:rPr>
-        <w:t xml:space="preserve">اليوم</w:t>
-      </w:r>
-      <w:r>
-        <w:rPr>
-          <w:rFonts w:ascii="Roboto Mono" w:cs="Roboto Mono" w:eastAsia="Roboto Mono" w:hAnsi="Roboto Mono"/>
-          <w:sz w:val="24"/>
-          <w:szCs w:val="24"/>
-          <w:rtl w:val="1"/>
-        </w:rPr>
-        <w:t xml:space="preserve"> 18:</w:t>
+        <w:t>اليوم 17:</w:t>
       </w:r>
     </w:p>
     <w:p>
@@ -28603,31 +26806,7 @@
               </w:rPr>
             </w:pPr>
             <w:r>
-              <w:rPr>
-                <w:rFonts w:ascii="Jomhuria" w:cs="Jomhuria" w:eastAsia="Jomhuria" w:hAnsi="Jomhuria"/>
-                <w:sz w:val="21"/>
-                <w:szCs w:val="21"/>
-                <w:rtl w:val="1"/>
-              </w:rPr>
-              <w:t xml:space="preserve">يوم</w:t>
-            </w:r>
-            <w:r>
-              <w:rPr>
-                <w:rFonts w:ascii="Jomhuria" w:cs="Jomhuria" w:eastAsia="Jomhuria" w:hAnsi="Jomhuria"/>
-                <w:sz w:val="21"/>
-                <w:szCs w:val="21"/>
-                <w:rtl w:val="1"/>
-              </w:rPr>
-              <w:t xml:space="preserve"> 4، 11:59 </w:t>
-            </w:r>
-            <w:r>
-              <w:rPr>
-                <w:rFonts w:ascii="Jomhuria" w:cs="Jomhuria" w:eastAsia="Jomhuria" w:hAnsi="Jomhuria"/>
-                <w:sz w:val="21"/>
-                <w:szCs w:val="21"/>
-                <w:rtl w:val="1"/>
-              </w:rPr>
-              <w:t xml:space="preserve">م</w:t>
+              <w:t>يوم 3، 11:59 م</w:t>
             </w:r>
           </w:p>
         </w:tc>
@@ -28768,31 +26947,7 @@
               </w:rPr>
             </w:pPr>
             <w:r>
-              <w:rPr>
-                <w:rFonts w:ascii="Jomhuria" w:cs="Jomhuria" w:eastAsia="Jomhuria" w:hAnsi="Jomhuria"/>
-                <w:sz w:val="21"/>
-                <w:szCs w:val="21"/>
-                <w:rtl w:val="1"/>
-              </w:rPr>
-              <w:t xml:space="preserve">يوم</w:t>
-            </w:r>
-            <w:r>
-              <w:rPr>
-                <w:rFonts w:ascii="Jomhuria" w:cs="Jomhuria" w:eastAsia="Jomhuria" w:hAnsi="Jomhuria"/>
-                <w:sz w:val="21"/>
-                <w:szCs w:val="21"/>
-                <w:rtl w:val="1"/>
-              </w:rPr>
-              <w:t xml:space="preserve"> 9، 11:59 </w:t>
-            </w:r>
-            <w:r>
-              <w:rPr>
-                <w:rFonts w:ascii="Jomhuria" w:cs="Jomhuria" w:eastAsia="Jomhuria" w:hAnsi="Jomhuria"/>
-                <w:sz w:val="21"/>
-                <w:szCs w:val="21"/>
-                <w:rtl w:val="1"/>
-              </w:rPr>
-              <w:t xml:space="preserve">م</w:t>
+              <w:t>يوم 8، 11:59 م</w:t>
             </w:r>
           </w:p>
         </w:tc>
@@ -28933,31 +27088,7 @@
               </w:rPr>
             </w:pPr>
             <w:r>
-              <w:rPr>
-                <w:rFonts w:ascii="Jomhuria" w:cs="Jomhuria" w:eastAsia="Jomhuria" w:hAnsi="Jomhuria"/>
-                <w:sz w:val="21"/>
-                <w:szCs w:val="21"/>
-                <w:rtl w:val="1"/>
-              </w:rPr>
-              <w:t xml:space="preserve">يوم</w:t>
-            </w:r>
-            <w:r>
-              <w:rPr>
-                <w:rFonts w:ascii="Jomhuria" w:cs="Jomhuria" w:eastAsia="Jomhuria" w:hAnsi="Jomhuria"/>
-                <w:sz w:val="21"/>
-                <w:szCs w:val="21"/>
-                <w:rtl w:val="1"/>
-              </w:rPr>
-              <w:t xml:space="preserve"> 15، 11:59 </w:t>
-            </w:r>
-            <w:r>
-              <w:rPr>
-                <w:rFonts w:ascii="Jomhuria" w:cs="Jomhuria" w:eastAsia="Jomhuria" w:hAnsi="Jomhuria"/>
-                <w:sz w:val="21"/>
-                <w:szCs w:val="21"/>
-                <w:rtl w:val="1"/>
-              </w:rPr>
-              <w:t xml:space="preserve">م</w:t>
+              <w:t>يوم 14، 11:59 م</w:t>
             </w:r>
           </w:p>
         </w:tc>
@@ -29107,31 +27238,7 @@
               </w:rPr>
             </w:pPr>
             <w:r>
-              <w:rPr>
-                <w:rFonts w:ascii="Jomhuria" w:cs="Jomhuria" w:eastAsia="Jomhuria" w:hAnsi="Jomhuria"/>
-                <w:sz w:val="21"/>
-                <w:szCs w:val="21"/>
-                <w:rtl w:val="1"/>
-              </w:rPr>
-              <w:t xml:space="preserve">يوم</w:t>
-            </w:r>
-            <w:r>
-              <w:rPr>
-                <w:rFonts w:ascii="Jomhuria" w:cs="Jomhuria" w:eastAsia="Jomhuria" w:hAnsi="Jomhuria"/>
-                <w:sz w:val="21"/>
-                <w:szCs w:val="21"/>
-                <w:rtl w:val="1"/>
-              </w:rPr>
-              <w:t xml:space="preserve"> 18، 11:59 </w:t>
-            </w:r>
-            <w:r>
-              <w:rPr>
-                <w:rFonts w:ascii="Jomhuria" w:cs="Jomhuria" w:eastAsia="Jomhuria" w:hAnsi="Jomhuria"/>
-                <w:sz w:val="21"/>
-                <w:szCs w:val="21"/>
-                <w:rtl w:val="1"/>
-              </w:rPr>
-              <w:t xml:space="preserve">م</w:t>
+              <w:t>يوم 17، 11:59 م</w:t>
             </w:r>
           </w:p>
         </w:tc>
@@ -31965,130 +30072,7 @@
         </w:rPr>
       </w:pPr>
       <w:r>
-        <w:rPr>
-          <w:rFonts w:ascii="Jomhuria" w:cs="Jomhuria" w:eastAsia="Jomhuria" w:hAnsi="Jomhuria"/>
-          <w:sz w:val="24"/>
-          <w:szCs w:val="24"/>
-          <w:rtl w:val="1"/>
-        </w:rPr>
-        <w:t xml:space="preserve">أول</w:t>
-      </w:r>
-      <w:r>
-        <w:rPr>
-          <w:rFonts w:ascii="Roboto" w:cs="Roboto" w:eastAsia="Roboto" w:hAnsi="Roboto"/>
-          <w:sz w:val="24"/>
-          <w:szCs w:val="24"/>
-          <w:rtl w:val="1"/>
-        </w:rPr>
-        <w:t xml:space="preserve"> </w:t>
-      </w:r>
-      <w:r>
-        <w:rPr>
-          <w:rFonts w:ascii="Jomhuria" w:cs="Jomhuria" w:eastAsia="Jomhuria" w:hAnsi="Jomhuria"/>
-          <w:sz w:val="24"/>
-          <w:szCs w:val="24"/>
-          <w:rtl w:val="1"/>
-        </w:rPr>
-        <w:t xml:space="preserve">موعد</w:t>
-      </w:r>
-      <w:r>
-        <w:rPr>
-          <w:rFonts w:ascii="Roboto" w:cs="Roboto" w:eastAsia="Roboto" w:hAnsi="Roboto"/>
-          <w:sz w:val="24"/>
-          <w:szCs w:val="24"/>
-          <w:rtl w:val="1"/>
-        </w:rPr>
-        <w:t xml:space="preserve"> </w:t>
-      </w:r>
-      <w:r>
-        <w:rPr>
-          <w:rFonts w:ascii="Jomhuria" w:cs="Jomhuria" w:eastAsia="Jomhuria" w:hAnsi="Jomhuria"/>
-          <w:sz w:val="24"/>
-          <w:szCs w:val="24"/>
-          <w:rtl w:val="1"/>
-        </w:rPr>
-        <w:t xml:space="preserve">نهائي</w:t>
-      </w:r>
-      <w:r>
-        <w:rPr>
-          <w:rFonts w:ascii="Roboto" w:cs="Roboto" w:eastAsia="Roboto" w:hAnsi="Roboto"/>
-          <w:sz w:val="24"/>
-          <w:szCs w:val="24"/>
-          <w:rtl w:val="1"/>
-        </w:rPr>
-        <w:t xml:space="preserve">: </w:t>
-      </w:r>
-      <w:r>
-        <w:rPr>
-          <w:rFonts w:ascii="Jomhuria" w:cs="Jomhuria" w:eastAsia="Jomhuria" w:hAnsi="Jomhuria"/>
-          <w:sz w:val="24"/>
-          <w:szCs w:val="24"/>
-          <w:rtl w:val="1"/>
-        </w:rPr>
-        <w:t xml:space="preserve">يوم</w:t>
-      </w:r>
-      <w:r>
-        <w:rPr>
-          <w:rFonts w:ascii="Jomhuria" w:cs="Jomhuria" w:eastAsia="Jomhuria" w:hAnsi="Jomhuria"/>
-          <w:sz w:val="24"/>
-          <w:szCs w:val="24"/>
-          <w:rtl w:val="1"/>
-        </w:rPr>
-        <w:t xml:space="preserve"> 4، 11:59 </w:t>
-      </w:r>
-      <w:r>
-        <w:rPr>
-          <w:rFonts w:ascii="Jomhuria" w:cs="Jomhuria" w:eastAsia="Jomhuria" w:hAnsi="Jomhuria"/>
-          <w:sz w:val="24"/>
-          <w:szCs w:val="24"/>
-          <w:rtl w:val="1"/>
-        </w:rPr>
-        <w:t xml:space="preserve">مساء</w:t>
-      </w:r>
-      <w:r>
-        <w:rPr>
-          <w:rFonts w:ascii="Jomhuria" w:cs="Jomhuria" w:eastAsia="Jomhuria" w:hAnsi="Jomhuria"/>
-          <w:sz w:val="24"/>
-          <w:szCs w:val="24"/>
-          <w:rtl w:val="1"/>
-        </w:rPr>
-        <w:t xml:space="preserve">ً - </w:t>
-      </w:r>
-      <w:r>
-        <w:rPr>
-          <w:rFonts w:ascii="Jomhuria" w:cs="Jomhuria" w:eastAsia="Jomhuria" w:hAnsi="Jomhuria"/>
-          <w:sz w:val="24"/>
-          <w:szCs w:val="24"/>
-          <w:rtl w:val="1"/>
-        </w:rPr>
-        <w:t xml:space="preserve">ابدأوا</w:t>
-      </w:r>
-      <w:r>
-        <w:rPr>
-          <w:rFonts w:ascii="Roboto" w:cs="Roboto" w:eastAsia="Roboto" w:hAnsi="Roboto"/>
-          <w:sz w:val="24"/>
-          <w:szCs w:val="24"/>
-          <w:rtl w:val="1"/>
-        </w:rPr>
-        <w:t xml:space="preserve"> </w:t>
-      </w:r>
-      <w:r>
-        <w:rPr>
-          <w:rFonts w:ascii="Jomhuria" w:cs="Jomhuria" w:eastAsia="Jomhuria" w:hAnsi="Jomhuria"/>
-          <w:sz w:val="24"/>
-          <w:szCs w:val="24"/>
-          <w:rtl w:val="1"/>
-        </w:rPr>
-        <w:t xml:space="preserve">الآن</w:t>
-      </w:r>
-      <w:r>
-        <w:rPr>
-          <w:rFonts w:ascii="Roboto" w:cs="Roboto" w:eastAsia="Roboto" w:hAnsi="Roboto"/>
-          <w:sz w:val="24"/>
-          <w:szCs w:val="24"/>
-          <w:rtl w:val="1"/>
-        </w:rPr>
-        <w:t xml:space="preserve">!</w:t>
+        <w:t>أول موعد نهائي: يوم 3، 11:59 مساءً - ابدأوا الآن!</w:t>
       </w:r>
     </w:p>
     <w:p>
@@ -32309,166 +30293,11 @@
         </w:rPr>
       </w:pPr>
       <w:r>
-        <w:rPr>
-          <w:rtl w:val="0"/>
-        </w:rPr>
-      </w:r>
-      <w:r>
-        <w:rPr>
-          <w:rFonts w:ascii="Roboto" w:cs="Roboto" w:eastAsia="Roboto" w:hAnsi="Roboto"/>
-          <w:sz w:val="24"/>
-          <w:szCs w:val="24"/>
-          <w:rtl w:val="1"/>
-        </w:rPr>
-        <w:t xml:space="preserve">📅 </w:t>
-      </w:r>
-      <w:r>
-        <w:rPr>
-          <w:rFonts w:ascii="Jomhuria" w:cs="Jomhuria" w:eastAsia="Jomhuria" w:hAnsi="Jomhuria"/>
-          <w:sz w:val="24"/>
-          <w:szCs w:val="24"/>
-          <w:rtl w:val="1"/>
-        </w:rPr>
-        <w:t xml:space="preserve">تاريخ</w:t>
-      </w:r>
-      <w:r>
-        <w:rPr>
-          <w:rFonts w:ascii="Roboto" w:cs="Roboto" w:eastAsia="Roboto" w:hAnsi="Roboto"/>
-          <w:sz w:val="24"/>
-          <w:szCs w:val="24"/>
-          <w:rtl w:val="1"/>
-        </w:rPr>
-        <w:t xml:space="preserve"> </w:t>
-      </w:r>
-      <w:r>
-        <w:rPr>
-          <w:rFonts w:ascii="Jomhuria" w:cs="Jomhuria" w:eastAsia="Jomhuria" w:hAnsi="Jomhuria"/>
-          <w:sz w:val="24"/>
-          <w:szCs w:val="24"/>
-          <w:rtl w:val="1"/>
-        </w:rPr>
-        <w:t xml:space="preserve">البدء</w:t>
-      </w:r>
-      <w:r>
-        <w:rPr>
-          <w:rFonts w:ascii="Roboto" w:cs="Roboto" w:eastAsia="Roboto" w:hAnsi="Roboto"/>
-          <w:sz w:val="24"/>
-          <w:szCs w:val="24"/>
-          <w:rtl w:val="1"/>
-        </w:rPr>
-        <w:t xml:space="preserve">: [</w:t>
-      </w:r>
-      <w:r>
-        <w:rPr>
-          <w:rFonts w:ascii="Jomhuria" w:cs="Jomhuria" w:eastAsia="Jomhuria" w:hAnsi="Jomhuria"/>
-          <w:sz w:val="24"/>
-          <w:szCs w:val="24"/>
-          <w:rtl w:val="1"/>
-        </w:rPr>
-        <w:t xml:space="preserve">اليوم</w:t>
-      </w:r>
-      <w:r>
-        <w:rPr>
-          <w:rFonts w:ascii="Roboto" w:cs="Roboto" w:eastAsia="Roboto" w:hAnsi="Roboto"/>
-          <w:sz w:val="24"/>
-          <w:szCs w:val="24"/>
-          <w:rtl w:val="1"/>
-        </w:rPr>
-        <w:t xml:space="preserve">]</w:t>
-        <w:br w:type="textWrapping"/>
-        <w:t xml:space="preserve">📅 </w:t>
-      </w:r>
-      <w:r>
-        <w:rPr>
-          <w:rFonts w:ascii="Jomhuria" w:cs="Jomhuria" w:eastAsia="Jomhuria" w:hAnsi="Jomhuria"/>
-          <w:sz w:val="24"/>
-          <w:szCs w:val="24"/>
-          <w:rtl w:val="1"/>
-        </w:rPr>
-        <w:t xml:space="preserve">المواعيد</w:t>
-      </w:r>
-      <w:r>
-        <w:rPr>
-          <w:rFonts w:ascii="Roboto" w:cs="Roboto" w:eastAsia="Roboto" w:hAnsi="Roboto"/>
-          <w:sz w:val="24"/>
-          <w:szCs w:val="24"/>
-          <w:rtl w:val="1"/>
-        </w:rPr>
-        <w:t xml:space="preserve"> </w:t>
-      </w:r>
-      <w:r>
-        <w:rPr>
-          <w:rFonts w:ascii="Jomhuria" w:cs="Jomhuria" w:eastAsia="Jomhuria" w:hAnsi="Jomhuria"/>
-          <w:sz w:val="24"/>
-          <w:szCs w:val="24"/>
-          <w:rtl w:val="1"/>
-        </w:rPr>
-        <w:t xml:space="preserve">النهائية</w:t>
-      </w:r>
-      <w:r>
-        <w:rPr>
-          <w:rFonts w:ascii="Roboto" w:cs="Roboto" w:eastAsia="Roboto" w:hAnsi="Roboto"/>
-          <w:sz w:val="24"/>
-          <w:szCs w:val="24"/>
-          <w:rtl w:val="1"/>
-        </w:rPr>
-        <w:t xml:space="preserve">: </w:t>
-      </w:r>
-      <w:r>
-        <w:rPr>
-          <w:rFonts w:ascii="Jomhuria" w:cs="Jomhuria" w:eastAsia="Jomhuria" w:hAnsi="Jomhuria"/>
-          <w:sz w:val="24"/>
-          <w:szCs w:val="24"/>
-          <w:rtl w:val="1"/>
-        </w:rPr>
-        <w:t xml:space="preserve">أيام</w:t>
-      </w:r>
-      <w:r>
-        <w:rPr>
-          <w:rFonts w:ascii="Arial Unicode MS" w:cs="Arial Unicode MS" w:eastAsia="Arial Unicode MS" w:hAnsi="Arial Unicode MS"/>
-          <w:sz w:val="24"/>
-          <w:szCs w:val="24"/>
-          <w:rtl w:val="1"/>
-        </w:rPr>
-        <w:t xml:space="preserve"> 4، 9، 15، 18، 21</w:t>
-        <w:br w:type="textWrapping"/>
-        <w:t xml:space="preserve">⏰ </w:t>
-      </w:r>
-      <w:r>
-        <w:rPr>
-          <w:rFonts w:ascii="Jomhuria" w:cs="Jomhuria" w:eastAsia="Jomhuria" w:hAnsi="Jomhuria"/>
-          <w:sz w:val="24"/>
-          <w:szCs w:val="24"/>
-          <w:rtl w:val="1"/>
-        </w:rPr>
-        <w:t xml:space="preserve">انطلقوا</w:t>
-      </w:r>
-      <w:r>
-        <w:rPr>
-          <w:rFonts w:ascii="Roboto" w:cs="Roboto" w:eastAsia="Roboto" w:hAnsi="Roboto"/>
-          <w:sz w:val="24"/>
-          <w:szCs w:val="24"/>
-          <w:rtl w:val="1"/>
-        </w:rPr>
-        <w:t xml:space="preserve"> </w:t>
-      </w:r>
-      <w:r>
-        <w:rPr>
-          <w:rFonts w:ascii="Jomhuria" w:cs="Jomhuria" w:eastAsia="Jomhuria" w:hAnsi="Jomhuria"/>
-          <w:sz w:val="24"/>
-          <w:szCs w:val="24"/>
-          <w:rtl w:val="1"/>
-        </w:rPr>
-        <w:t xml:space="preserve">الآن</w:t>
-      </w:r>
-      <w:r>
-        <w:rPr>
-          <w:rFonts w:ascii="Roboto" w:cs="Roboto" w:eastAsia="Roboto" w:hAnsi="Roboto"/>
-          <w:sz w:val="24"/>
-          <w:szCs w:val="24"/>
-          <w:rtl w:val="1"/>
-        </w:rPr>
-        <w:t xml:space="preserve">!</w:t>
+        <w:t>📅 تاريخ البدء: [اليوم]</w:t>
+        <w:br/>
+        <w:t>📅 المواعيد النهائية: أيام 3، 8، 14، 17، 21</w:t>
+        <w:br/>
+        <w:t>⏰ انطلقوا الآن!</w:t>
       </w:r>
     </w:p>
     <w:p>

</xml_diff>